<commit_message>
Update project 2026 - 05 - 08
</commit_message>
<xml_diff>
--- a/Report.docx
+++ b/Report.docx
@@ -564,7 +564,7 @@
           <w:r>
             <w:fldChar w:fldCharType="separate"/>
           </w:r>
-          <w:hyperlink w:anchor="_Toc229164915" w:history="1">
+          <w:hyperlink w:anchor="_Toc229165826" w:history="1">
             <w:r>
               <w:rPr>
                 <w:rStyle w:val="Hyperlink"/>
@@ -591,7 +591,7 @@
                 <w:noProof/>
                 <w:webHidden/>
               </w:rPr>
-              <w:instrText xml:space="preserve"> PAGEREF _Toc229164915 \h </w:instrText>
+              <w:instrText xml:space="preserve"> PAGEREF _Toc229165826 \h </w:instrText>
             </w:r>
             <w:r>
               <w:rPr>
@@ -635,7 +635,7 @@
               <w:lang w:eastAsia="nl-NL"/>
             </w:rPr>
           </w:pPr>
-          <w:hyperlink w:anchor="_Toc229164916" w:history="1">
+          <w:hyperlink w:anchor="_Toc229165827" w:history="1">
             <w:r>
               <w:rPr>
                 <w:rStyle w:val="Hyperlink"/>
@@ -662,7 +662,7 @@
                 <w:noProof/>
                 <w:webHidden/>
               </w:rPr>
-              <w:instrText xml:space="preserve"> PAGEREF _Toc229164916 \h </w:instrText>
+              <w:instrText xml:space="preserve"> PAGEREF _Toc229165827 \h </w:instrText>
             </w:r>
             <w:r>
               <w:rPr>
@@ -706,7 +706,7 @@
               <w:lang w:eastAsia="nl-NL"/>
             </w:rPr>
           </w:pPr>
-          <w:hyperlink w:anchor="_Toc229164917" w:history="1">
+          <w:hyperlink w:anchor="_Toc229165828" w:history="1">
             <w:r>
               <w:rPr>
                 <w:rStyle w:val="Hyperlink"/>
@@ -733,7 +733,7 @@
                 <w:noProof/>
                 <w:webHidden/>
               </w:rPr>
-              <w:instrText xml:space="preserve"> PAGEREF _Toc229164917 \h </w:instrText>
+              <w:instrText xml:space="preserve"> PAGEREF _Toc229165828 \h </w:instrText>
             </w:r>
             <w:r>
               <w:rPr>
@@ -777,13 +777,13 @@
               <w:lang w:eastAsia="nl-NL"/>
             </w:rPr>
           </w:pPr>
-          <w:hyperlink w:anchor="_Toc229164918" w:history="1">
+          <w:hyperlink w:anchor="_Toc229165829" w:history="1">
             <w:r>
               <w:rPr>
                 <w:rStyle w:val="Hyperlink"/>
                 <w:noProof/>
               </w:rPr>
-              <w:t>1.3 – Onderzoeksvragen</w:t>
+              <w:t>1.3 – Gebruikte technieken en tools</w:t>
             </w:r>
             <w:r>
               <w:rPr>
@@ -804,7 +804,7 @@
                 <w:noProof/>
                 <w:webHidden/>
               </w:rPr>
-              <w:instrText xml:space="preserve"> PAGEREF _Toc229164918 \h </w:instrText>
+              <w:instrText xml:space="preserve"> PAGEREF _Toc229165829 \h </w:instrText>
             </w:r>
             <w:r>
               <w:rPr>
@@ -848,78 +848,7 @@
               <w:lang w:eastAsia="nl-NL"/>
             </w:rPr>
           </w:pPr>
-          <w:hyperlink w:anchor="_Toc229164919" w:history="1">
-            <w:r>
-              <w:rPr>
-                <w:rStyle w:val="Hyperlink"/>
-                <w:noProof/>
-              </w:rPr>
-              <w:t>1.4 – Gebruikte technieken en tools</w:t>
-            </w:r>
-            <w:r>
-              <w:rPr>
-                <w:noProof/>
-                <w:webHidden/>
-              </w:rPr>
-              <w:tab/>
-            </w:r>
-            <w:r>
-              <w:rPr>
-                <w:noProof/>
-                <w:webHidden/>
-              </w:rPr>
-              <w:fldChar w:fldCharType="begin"/>
-            </w:r>
-            <w:r>
-              <w:rPr>
-                <w:noProof/>
-                <w:webHidden/>
-              </w:rPr>
-              <w:instrText xml:space="preserve"> PAGEREF _Toc229164919 \h </w:instrText>
-            </w:r>
-            <w:r>
-              <w:rPr>
-                <w:noProof/>
-                <w:webHidden/>
-              </w:rPr>
-            </w:r>
-            <w:r>
-              <w:rPr>
-                <w:noProof/>
-                <w:webHidden/>
-              </w:rPr>
-              <w:fldChar w:fldCharType="separate"/>
-            </w:r>
-            <w:r>
-              <w:rPr>
-                <w:noProof/>
-                <w:webHidden/>
-              </w:rPr>
-              <w:t>4</w:t>
-            </w:r>
-            <w:r>
-              <w:rPr>
-                <w:noProof/>
-                <w:webHidden/>
-              </w:rPr>
-              <w:fldChar w:fldCharType="end"/>
-            </w:r>
-          </w:hyperlink>
-        </w:p>
-        <w:p>
-          <w:pPr>
-            <w:pStyle w:val="Inhopg1"/>
-            <w:tabs>
-              <w:tab w:val="right" w:leader="dot" w:pos="9062"/>
-            </w:tabs>
-            <w:rPr>
-              <w:rFonts w:eastAsiaTheme="minorEastAsia"/>
-              <w:noProof/>
-              <w:sz w:val="24"/>
-              <w:lang w:eastAsia="nl-NL"/>
-            </w:rPr>
-          </w:pPr>
-          <w:hyperlink w:anchor="_Toc229164920" w:history="1">
+          <w:hyperlink w:anchor="_Toc229165830" w:history="1">
             <w:r>
               <w:rPr>
                 <w:rStyle w:val="Hyperlink"/>
@@ -946,7 +875,7 @@
                 <w:noProof/>
                 <w:webHidden/>
               </w:rPr>
-              <w:instrText xml:space="preserve"> PAGEREF _Toc229164920 \h </w:instrText>
+              <w:instrText xml:space="preserve"> PAGEREF _Toc229165830 \h </w:instrText>
             </w:r>
             <w:r>
               <w:rPr>
@@ -990,7 +919,7 @@
               <w:lang w:eastAsia="nl-NL"/>
             </w:rPr>
           </w:pPr>
-          <w:hyperlink w:anchor="_Toc229164921" w:history="1">
+          <w:hyperlink w:anchor="_Toc229165831" w:history="1">
             <w:r>
               <w:rPr>
                 <w:rStyle w:val="Hyperlink"/>
@@ -1017,7 +946,7 @@
                 <w:noProof/>
                 <w:webHidden/>
               </w:rPr>
-              <w:instrText xml:space="preserve"> PAGEREF _Toc229164921 \h </w:instrText>
+              <w:instrText xml:space="preserve"> PAGEREF _Toc229165831 \h </w:instrText>
             </w:r>
             <w:r>
               <w:rPr>
@@ -1061,13 +990,13 @@
               <w:lang w:eastAsia="nl-NL"/>
             </w:rPr>
           </w:pPr>
-          <w:hyperlink w:anchor="_Toc229164922" w:history="1">
+          <w:hyperlink w:anchor="_Toc229165832" w:history="1">
             <w:r>
               <w:rPr>
                 <w:rStyle w:val="Hyperlink"/>
                 <w:noProof/>
               </w:rPr>
-              <w:t>Conclusie</w:t>
+              <w:t>3. Conclusie</w:t>
             </w:r>
             <w:r>
               <w:rPr>
@@ -1088,7 +1017,7 @@
                 <w:noProof/>
                 <w:webHidden/>
               </w:rPr>
-              <w:instrText xml:space="preserve"> PAGEREF _Toc229164922 \h </w:instrText>
+              <w:instrText xml:space="preserve"> PAGEREF _Toc229165832 \h </w:instrText>
             </w:r>
             <w:r>
               <w:rPr>
@@ -1132,7 +1061,7 @@
               <w:lang w:eastAsia="nl-NL"/>
             </w:rPr>
           </w:pPr>
-          <w:hyperlink w:anchor="_Toc229164923" w:history="1">
+          <w:hyperlink w:anchor="_Toc229165833" w:history="1">
             <w:r>
               <w:rPr>
                 <w:rStyle w:val="Hyperlink"/>
@@ -1159,7 +1088,7 @@
                 <w:noProof/>
                 <w:webHidden/>
               </w:rPr>
-              <w:instrText xml:space="preserve"> PAGEREF _Toc229164923 \h </w:instrText>
+              <w:instrText xml:space="preserve"> PAGEREF _Toc229165833 \h </w:instrText>
             </w:r>
             <w:r>
               <w:rPr>
@@ -1203,7 +1132,7 @@
               <w:lang w:eastAsia="nl-NL"/>
             </w:rPr>
           </w:pPr>
-          <w:hyperlink w:anchor="_Toc229164924" w:history="1">
+          <w:hyperlink w:anchor="_Toc229165834" w:history="1">
             <w:r>
               <w:rPr>
                 <w:rStyle w:val="Hyperlink"/>
@@ -1230,7 +1159,7 @@
                 <w:noProof/>
                 <w:webHidden/>
               </w:rPr>
-              <w:instrText xml:space="preserve"> PAGEREF _Toc229164924 \h </w:instrText>
+              <w:instrText xml:space="preserve"> PAGEREF _Toc229165834 \h </w:instrText>
             </w:r>
             <w:r>
               <w:rPr>
@@ -1274,7 +1203,7 @@
               <w:lang w:eastAsia="nl-NL"/>
             </w:rPr>
           </w:pPr>
-          <w:hyperlink w:anchor="_Toc229164925" w:history="1">
+          <w:hyperlink w:anchor="_Toc229165835" w:history="1">
             <w:r>
               <w:rPr>
                 <w:rStyle w:val="Hyperlink"/>
@@ -1301,7 +1230,7 @@
                 <w:noProof/>
                 <w:webHidden/>
               </w:rPr>
-              <w:instrText xml:space="preserve"> PAGEREF _Toc229164925 \h </w:instrText>
+              <w:instrText xml:space="preserve"> PAGEREF _Toc229165835 \h </w:instrText>
             </w:r>
             <w:r>
               <w:rPr>
@@ -1345,7 +1274,7 @@
               <w:lang w:eastAsia="nl-NL"/>
             </w:rPr>
           </w:pPr>
-          <w:hyperlink w:anchor="_Toc229164926" w:history="1">
+          <w:hyperlink w:anchor="_Toc229165836" w:history="1">
             <w:r>
               <w:rPr>
                 <w:rStyle w:val="Hyperlink"/>
@@ -1372,7 +1301,7 @@
                 <w:noProof/>
                 <w:webHidden/>
               </w:rPr>
-              <w:instrText xml:space="preserve"> PAGEREF _Toc229164926 \h </w:instrText>
+              <w:instrText xml:space="preserve"> PAGEREF _Toc229165836 \h </w:instrText>
             </w:r>
             <w:r>
               <w:rPr>
@@ -1431,9 +1360,8 @@
       <w:pPr>
         <w:pStyle w:val="Titel"/>
       </w:pPr>
-      <w:bookmarkStart w:id="0" w:name="_Toc229164915"/>
+      <w:bookmarkStart w:id="0" w:name="_Toc229165826"/>
       <w:r>
-        <w:lastRenderedPageBreak/>
         <w:t xml:space="preserve">1. </w:t>
       </w:r>
       <w:r>
@@ -1445,7 +1373,7 @@
       <w:pPr>
         <w:pStyle w:val="Kop1"/>
       </w:pPr>
-      <w:bookmarkStart w:id="1" w:name="_Toc229164916"/>
+      <w:bookmarkStart w:id="1" w:name="_Toc229165827"/>
       <w:r>
         <w:t xml:space="preserve">1.1 – </w:t>
       </w:r>
@@ -1469,18 +1397,9 @@
       <w:pPr>
         <w:pStyle w:val="Kop1"/>
       </w:pPr>
-      <w:bookmarkStart w:id="2" w:name="_Toc229164917"/>
+      <w:bookmarkStart w:id="2" w:name="_Toc229165828"/>
       <w:r>
-        <w:t>1.</w:t>
-      </w:r>
-      <w:r>
-        <w:t>2</w:t>
-      </w:r>
-      <w:r>
-        <w:t xml:space="preserve"> –</w:t>
-      </w:r>
-      <w:r>
-        <w:t xml:space="preserve"> </w:t>
+        <w:t xml:space="preserve">1.2 – </w:t>
       </w:r>
       <w:r>
         <w:t>Doel van het onderzoek</w:t>
@@ -1542,7 +1461,7 @@
       <w:pPr>
         <w:pStyle w:val="Kop1"/>
       </w:pPr>
-      <w:bookmarkStart w:id="3" w:name="_Toc229164919"/>
+      <w:bookmarkStart w:id="3" w:name="_Toc229165829"/>
       <w:r>
         <w:t>1.</w:t>
       </w:r>
@@ -1658,7 +1577,6 @@
           <w:b/>
           <w:bCs/>
         </w:rPr>
-        <w:lastRenderedPageBreak/>
         <w:t>Daarnaast zijn verschillende analysetechnieken toegepast, waaronder:</w:t>
       </w:r>
     </w:p>
@@ -1716,9 +1634,8 @@
       <w:pPr>
         <w:pStyle w:val="Titel"/>
       </w:pPr>
-      <w:bookmarkStart w:id="4" w:name="_Toc229164920"/>
+      <w:bookmarkStart w:id="4" w:name="_Toc229165830"/>
       <w:r>
-        <w:lastRenderedPageBreak/>
         <w:t xml:space="preserve">2. </w:t>
       </w:r>
       <w:r>
@@ -1730,7 +1647,7 @@
       <w:pPr>
         <w:pStyle w:val="Kop1"/>
       </w:pPr>
-      <w:bookmarkStart w:id="5" w:name="_Toc229164921"/>
+      <w:bookmarkStart w:id="5" w:name="_Toc229165831"/>
       <w:r>
         <w:t>2</w:t>
       </w:r>
@@ -1758,7 +1675,7 @@
           <w:noProof/>
         </w:rPr>
         <w:drawing>
-          <wp:inline distT="0" distB="0" distL="0" distR="0" wp14:anchorId="3520C4B2" wp14:editId="5E17D160">
+          <wp:inline distT="0" distB="0" distL="0" distR="0" wp14:anchorId="3520C4B2" wp14:editId="33123A62">
             <wp:extent cx="5760720" cy="2901315"/>
             <wp:effectExtent l="0" t="0" r="0" b="0"/>
             <wp:docPr id="926634137" name="Afbeelding 6"/>
@@ -1849,9 +1766,8 @@
         <w:rPr>
           <w:noProof/>
         </w:rPr>
-        <w:lastRenderedPageBreak/>
         <w:drawing>
-          <wp:inline distT="0" distB="0" distL="0" distR="0" wp14:anchorId="2FACF298" wp14:editId="01620B3D">
+          <wp:inline distT="0" distB="0" distL="0" distR="0" wp14:anchorId="2FACF298" wp14:editId="5CEE0A69">
             <wp:extent cx="5760720" cy="2901315"/>
             <wp:effectExtent l="0" t="0" r="0" b="0"/>
             <wp:docPr id="1280696176" name="Afbeelding 8"/>
@@ -1897,7 +1813,7 @@
           <w:noProof/>
         </w:rPr>
         <w:drawing>
-          <wp:inline distT="0" distB="0" distL="0" distR="0" wp14:anchorId="3CBF856F" wp14:editId="5661CF7E">
+          <wp:inline distT="0" distB="0" distL="0" distR="0" wp14:anchorId="3CBF856F" wp14:editId="57DD395A">
             <wp:extent cx="5760720" cy="2901315"/>
             <wp:effectExtent l="0" t="0" r="0" b="0"/>
             <wp:docPr id="1135620991" name="Afbeelding 9"/>
@@ -1952,9 +1868,8 @@
       <w:pPr>
         <w:pStyle w:val="Titel"/>
       </w:pPr>
-      <w:bookmarkStart w:id="6" w:name="_Toc229164922"/>
+      <w:bookmarkStart w:id="6" w:name="_Toc229165832"/>
       <w:r>
-        <w:lastRenderedPageBreak/>
         <w:t xml:space="preserve">3. </w:t>
       </w:r>
       <w:r>
@@ -1966,7 +1881,7 @@
       <w:pPr>
         <w:pStyle w:val="Kop1"/>
       </w:pPr>
-      <w:bookmarkStart w:id="7" w:name="_Toc229164923"/>
+      <w:bookmarkStart w:id="7" w:name="_Toc229165833"/>
       <w:r>
         <w:t>3</w:t>
       </w:r>
@@ -1989,9 +1904,8 @@
       <w:pPr>
         <w:pStyle w:val="Titel"/>
       </w:pPr>
-      <w:bookmarkStart w:id="8" w:name="_Toc229164924"/>
+      <w:bookmarkStart w:id="8" w:name="_Toc229165834"/>
       <w:r>
-        <w:lastRenderedPageBreak/>
         <w:t xml:space="preserve">4. </w:t>
       </w:r>
       <w:r>
@@ -2001,7 +1915,7 @@
     </w:p>
     <w:p/>
     <w:p>
-      <w:bookmarkStart w:id="9" w:name="_Toc229164925"/>
+      <w:bookmarkStart w:id="9" w:name="_Toc229165835"/>
       <w:r>
         <w:rPr>
           <w:rStyle w:val="Kop1Char"/>
@@ -2062,7 +1976,7 @@
           <w:bCs/>
         </w:rPr>
       </w:pPr>
-      <w:bookmarkStart w:id="10" w:name="_Toc229164926"/>
+      <w:bookmarkStart w:id="10" w:name="_Toc229165836"/>
       <w:r>
         <w:rPr>
           <w:rStyle w:val="Kop1Char"/>
@@ -21103,6 +21017,7 @@
   <w:style w:type="character" w:default="1" w:styleId="Standaardalinea-lettertype">
     <w:name w:val="Default Paragraph Font"/>
     <w:uiPriority w:val="1"/>
+    <w:semiHidden/>
     <w:unhideWhenUsed/>
   </w:style>
   <w:style w:type="table" w:default="1" w:styleId="Standaardtabel">

</xml_diff>

<commit_message>
Update project 2026 - 05 - 09
</commit_message>
<xml_diff>
--- a/Report.docx
+++ b/Report.docx
@@ -19,7 +19,7 @@
           <w:noProof/>
         </w:rPr>
         <w:drawing>
-          <wp:anchor distT="0" distB="0" distL="114300" distR="114300" simplePos="0" relativeHeight="251658240" behindDoc="1" locked="0" layoutInCell="1" allowOverlap="1" wp14:anchorId="0A414172" wp14:editId="6D57E92C">
+          <wp:anchor distT="0" distB="0" distL="114300" distR="114300" simplePos="0" relativeHeight="251657216" behindDoc="1" locked="0" layoutInCell="1" allowOverlap="1" wp14:anchorId="0A414172" wp14:editId="15A6F00C">
             <wp:simplePos x="0" y="0"/>
             <wp:positionH relativeFrom="column">
               <wp:posOffset>-566311</wp:posOffset>
@@ -108,7 +108,7 @@
         <mc:AlternateContent>
           <mc:Choice Requires="wps">
             <w:drawing>
-              <wp:anchor distT="0" distB="0" distL="114300" distR="114300" simplePos="0" relativeHeight="251657215" behindDoc="1" locked="0" layoutInCell="1" allowOverlap="1" wp14:anchorId="1820F234" wp14:editId="5B0437DC">
+              <wp:anchor distT="0" distB="0" distL="114300" distR="114300" simplePos="0" relativeHeight="251656191" behindDoc="1" locked="0" layoutInCell="1" allowOverlap="1" wp14:anchorId="1820F234" wp14:editId="672BC810">
                 <wp:simplePos x="0" y="0"/>
                 <wp:positionH relativeFrom="column">
                   <wp:posOffset>-975365</wp:posOffset>
@@ -179,7 +179,7 @@
           </mc:Choice>
           <mc:Fallback>
             <w:pict>
-              <v:rect w14:anchorId="6A402A84" id="Rechthoek 2" o:spid="_x0000_s1026" style="position:absolute;margin-left:-76.8pt;margin-top:13.35pt;width:600.3pt;height:107.1pt;z-index:-251659265;visibility:visible;mso-wrap-style:square;mso-width-percent:0;mso-height-percent:0;mso-wrap-distance-left:9pt;mso-wrap-distance-top:0;mso-wrap-distance-right:9pt;mso-wrap-distance-bottom:0;mso-position-horizontal:absolute;mso-position-horizontal-relative:text;mso-position-vertical:absolute;mso-position-vertical-relative:text;mso-width-percent:0;mso-height-percent:0;mso-width-relative:margin;mso-height-relative:margin;v-text-anchor:middle" o:gfxdata="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" fillcolor="#4e95d9 [1631]" stroked="f" strokeweight="1.5pt"/>
+              <v:rect w14:anchorId="546A47D7" id="Rechthoek 2" o:spid="_x0000_s1026" style="position:absolute;margin-left:-76.8pt;margin-top:13.35pt;width:600.3pt;height:107.1pt;z-index:-251660289;visibility:visible;mso-wrap-style:square;mso-width-percent:0;mso-height-percent:0;mso-wrap-distance-left:9pt;mso-wrap-distance-top:0;mso-wrap-distance-right:9pt;mso-wrap-distance-bottom:0;mso-position-horizontal:absolute;mso-position-horizontal-relative:text;mso-position-vertical:absolute;mso-position-vertical-relative:text;mso-width-percent:0;mso-height-percent:0;mso-width-relative:margin;mso-height-relative:margin;v-text-anchor:middle" o:gfxdata="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" fillcolor="#4e95d9 [1631]" stroked="f" strokeweight="1.5pt"/>
             </w:pict>
           </mc:Fallback>
         </mc:AlternateContent>
@@ -209,7 +209,7 @@
         <mc:AlternateContent>
           <mc:Choice Requires="wps">
             <w:drawing>
-              <wp:anchor distT="45720" distB="45720" distL="114300" distR="114300" simplePos="0" relativeHeight="251660288" behindDoc="1" locked="0" layoutInCell="1" allowOverlap="1" wp14:anchorId="785902C0" wp14:editId="139B8E94">
+              <wp:anchor distT="45720" distB="45720" distL="114300" distR="114300" simplePos="0" relativeHeight="251659264" behindDoc="1" locked="0" layoutInCell="1" allowOverlap="1" wp14:anchorId="785902C0" wp14:editId="4053B4DB">
                 <wp:simplePos x="0" y="0"/>
                 <wp:positionH relativeFrom="column">
                   <wp:posOffset>490855</wp:posOffset>
@@ -374,7 +374,7 @@
                 <v:stroke joinstyle="miter"/>
                 <v:path gradientshapeok="t" o:connecttype="rect"/>
               </v:shapetype>
-              <v:shape id="Tekstvak 2" o:spid="_x0000_s1026" type="#_x0000_t202" style="position:absolute;margin-left:38.65pt;margin-top:8.95pt;width:374.65pt;height:130.75pt;z-index:-251656192;visibility:visible;mso-wrap-style:square;mso-width-percent:0;mso-height-percent:0;mso-wrap-distance-left:9pt;mso-wrap-distance-top:3.6pt;mso-wrap-distance-right:9pt;mso-wrap-distance-bottom:3.6pt;mso-position-horizontal:absolute;mso-position-horizontal-relative:text;mso-position-vertical:absolute;mso-position-vertical-relative:text;mso-width-percent:0;mso-height-percent:0;mso-width-relative:margin;mso-height-relative:margin;v-text-anchor:top" o:gfxdata="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" strokecolor="#83caeb [1300]" strokeweight="3pt">
+              <v:shape id="Tekstvak 2" o:spid="_x0000_s1026" type="#_x0000_t202" style="position:absolute;margin-left:38.65pt;margin-top:8.95pt;width:374.65pt;height:130.75pt;z-index:-251657216;visibility:visible;mso-wrap-style:square;mso-width-percent:0;mso-height-percent:0;mso-wrap-distance-left:9pt;mso-wrap-distance-top:3.6pt;mso-wrap-distance-right:9pt;mso-wrap-distance-bottom:3.6pt;mso-position-horizontal:absolute;mso-position-horizontal-relative:text;mso-position-vertical:absolute;mso-position-vertical-relative:text;mso-width-percent:0;mso-height-percent:0;mso-width-relative:margin;mso-height-relative:margin;v-text-anchor:top" o:gfxdata="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" strokecolor="#83caeb [1300]" strokeweight="3pt">
                 <v:textbox>
                   <w:txbxContent>
                     <w:p>
@@ -564,7 +564,7 @@
           <w:r>
             <w:fldChar w:fldCharType="separate"/>
           </w:r>
-          <w:hyperlink w:anchor="_Toc229165826" w:history="1">
+          <w:hyperlink w:anchor="_Toc229247792" w:history="1">
             <w:r>
               <w:rPr>
                 <w:rStyle w:val="Hyperlink"/>
@@ -591,7 +591,7 @@
                 <w:noProof/>
                 <w:webHidden/>
               </w:rPr>
-              <w:instrText xml:space="preserve"> PAGEREF _Toc229165826 \h </w:instrText>
+              <w:instrText xml:space="preserve"> PAGEREF _Toc229247792 \h </w:instrText>
             </w:r>
             <w:r>
               <w:rPr>
@@ -635,7 +635,7 @@
               <w:lang w:eastAsia="nl-NL"/>
             </w:rPr>
           </w:pPr>
-          <w:hyperlink w:anchor="_Toc229165827" w:history="1">
+          <w:hyperlink w:anchor="_Toc229247793" w:history="1">
             <w:r>
               <w:rPr>
                 <w:rStyle w:val="Hyperlink"/>
@@ -662,7 +662,7 @@
                 <w:noProof/>
                 <w:webHidden/>
               </w:rPr>
-              <w:instrText xml:space="preserve"> PAGEREF _Toc229165827 \h </w:instrText>
+              <w:instrText xml:space="preserve"> PAGEREF _Toc229247793 \h </w:instrText>
             </w:r>
             <w:r>
               <w:rPr>
@@ -706,7 +706,7 @@
               <w:lang w:eastAsia="nl-NL"/>
             </w:rPr>
           </w:pPr>
-          <w:hyperlink w:anchor="_Toc229165828" w:history="1">
+          <w:hyperlink w:anchor="_Toc229247794" w:history="1">
             <w:r>
               <w:rPr>
                 <w:rStyle w:val="Hyperlink"/>
@@ -733,7 +733,7 @@
                 <w:noProof/>
                 <w:webHidden/>
               </w:rPr>
-              <w:instrText xml:space="preserve"> PAGEREF _Toc229165828 \h </w:instrText>
+              <w:instrText xml:space="preserve"> PAGEREF _Toc229247794 \h </w:instrText>
             </w:r>
             <w:r>
               <w:rPr>
@@ -777,7 +777,7 @@
               <w:lang w:eastAsia="nl-NL"/>
             </w:rPr>
           </w:pPr>
-          <w:hyperlink w:anchor="_Toc229165829" w:history="1">
+          <w:hyperlink w:anchor="_Toc229247795" w:history="1">
             <w:r>
               <w:rPr>
                 <w:rStyle w:val="Hyperlink"/>
@@ -804,7 +804,7 @@
                 <w:noProof/>
                 <w:webHidden/>
               </w:rPr>
-              <w:instrText xml:space="preserve"> PAGEREF _Toc229165829 \h </w:instrText>
+              <w:instrText xml:space="preserve"> PAGEREF _Toc229247795 \h </w:instrText>
             </w:r>
             <w:r>
               <w:rPr>
@@ -848,7 +848,7 @@
               <w:lang w:eastAsia="nl-NL"/>
             </w:rPr>
           </w:pPr>
-          <w:hyperlink w:anchor="_Toc229165830" w:history="1">
+          <w:hyperlink w:anchor="_Toc229247796" w:history="1">
             <w:r>
               <w:rPr>
                 <w:rStyle w:val="Hyperlink"/>
@@ -875,7 +875,7 @@
                 <w:noProof/>
                 <w:webHidden/>
               </w:rPr>
-              <w:instrText xml:space="preserve"> PAGEREF _Toc229165830 \h </w:instrText>
+              <w:instrText xml:space="preserve"> PAGEREF _Toc229247796 \h </w:instrText>
             </w:r>
             <w:r>
               <w:rPr>
@@ -919,13 +919,13 @@
               <w:lang w:eastAsia="nl-NL"/>
             </w:rPr>
           </w:pPr>
-          <w:hyperlink w:anchor="_Toc229165831" w:history="1">
+          <w:hyperlink w:anchor="_Toc229247797" w:history="1">
             <w:r>
               <w:rPr>
                 <w:rStyle w:val="Hyperlink"/>
                 <w:noProof/>
               </w:rPr>
-              <w:t>2.1 – x</w:t>
+              <w:t>2.1 – Relatie tussen energieverbruik en CO2-uitstoot</w:t>
             </w:r>
             <w:r>
               <w:rPr>
@@ -946,7 +946,7 @@
                 <w:noProof/>
                 <w:webHidden/>
               </w:rPr>
-              <w:instrText xml:space="preserve"> PAGEREF _Toc229165831 \h </w:instrText>
+              <w:instrText xml:space="preserve"> PAGEREF _Toc229247797 \h </w:instrText>
             </w:r>
             <w:r>
               <w:rPr>
@@ -990,13 +990,13 @@
               <w:lang w:eastAsia="nl-NL"/>
             </w:rPr>
           </w:pPr>
-          <w:hyperlink w:anchor="_Toc229165832" w:history="1">
+          <w:hyperlink w:anchor="_Toc229247798" w:history="1">
             <w:r>
               <w:rPr>
                 <w:rStyle w:val="Hyperlink"/>
                 <w:noProof/>
               </w:rPr>
-              <w:t>3. Conclusie</w:t>
+              <w:t>2.2 – Landen met grootste daling in CO2-uitstoot per capita</w:t>
             </w:r>
             <w:r>
               <w:rPr>
@@ -1017,7 +1017,78 @@
                 <w:noProof/>
                 <w:webHidden/>
               </w:rPr>
-              <w:instrText xml:space="preserve"> PAGEREF _Toc229165832 \h </w:instrText>
+              <w:instrText xml:space="preserve"> PAGEREF _Toc229247798 \h </w:instrText>
+            </w:r>
+            <w:r>
+              <w:rPr>
+                <w:noProof/>
+                <w:webHidden/>
+              </w:rPr>
+            </w:r>
+            <w:r>
+              <w:rPr>
+                <w:noProof/>
+                <w:webHidden/>
+              </w:rPr>
+              <w:fldChar w:fldCharType="separate"/>
+            </w:r>
+            <w:r>
+              <w:rPr>
+                <w:noProof/>
+                <w:webHidden/>
+              </w:rPr>
+              <w:t>6</w:t>
+            </w:r>
+            <w:r>
+              <w:rPr>
+                <w:noProof/>
+                <w:webHidden/>
+              </w:rPr>
+              <w:fldChar w:fldCharType="end"/>
+            </w:r>
+          </w:hyperlink>
+        </w:p>
+        <w:p>
+          <w:pPr>
+            <w:pStyle w:val="Inhopg1"/>
+            <w:tabs>
+              <w:tab w:val="right" w:leader="dot" w:pos="9062"/>
+            </w:tabs>
+            <w:rPr>
+              <w:rFonts w:eastAsiaTheme="minorEastAsia"/>
+              <w:noProof/>
+              <w:sz w:val="24"/>
+              <w:lang w:eastAsia="nl-NL"/>
+            </w:rPr>
+          </w:pPr>
+          <w:hyperlink w:anchor="_Toc229247799" w:history="1">
+            <w:r>
+              <w:rPr>
+                <w:rStyle w:val="Hyperlink"/>
+                <w:noProof/>
+              </w:rPr>
+              <w:t>2.3 – Verwachte groei van duurzame energiebronnen</w:t>
+            </w:r>
+            <w:r>
+              <w:rPr>
+                <w:noProof/>
+                <w:webHidden/>
+              </w:rPr>
+              <w:tab/>
+            </w:r>
+            <w:r>
+              <w:rPr>
+                <w:noProof/>
+                <w:webHidden/>
+              </w:rPr>
+              <w:fldChar w:fldCharType="begin"/>
+            </w:r>
+            <w:r>
+              <w:rPr>
+                <w:noProof/>
+                <w:webHidden/>
+              </w:rPr>
+              <w:instrText xml:space="preserve"> PAGEREF _Toc229247799 \h </w:instrText>
             </w:r>
             <w:r>
               <w:rPr>
@@ -1061,7 +1132,78 @@
               <w:lang w:eastAsia="nl-NL"/>
             </w:rPr>
           </w:pPr>
-          <w:hyperlink w:anchor="_Toc229165833" w:history="1">
+          <w:hyperlink w:anchor="_Toc229247800" w:history="1">
+            <w:r>
+              <w:rPr>
+                <w:rStyle w:val="Hyperlink"/>
+                <w:noProof/>
+              </w:rPr>
+              <w:t>3. Conclusie</w:t>
+            </w:r>
+            <w:r>
+              <w:rPr>
+                <w:noProof/>
+                <w:webHidden/>
+              </w:rPr>
+              <w:tab/>
+            </w:r>
+            <w:r>
+              <w:rPr>
+                <w:noProof/>
+                <w:webHidden/>
+              </w:rPr>
+              <w:fldChar w:fldCharType="begin"/>
+            </w:r>
+            <w:r>
+              <w:rPr>
+                <w:noProof/>
+                <w:webHidden/>
+              </w:rPr>
+              <w:instrText xml:space="preserve"> PAGEREF _Toc229247800 \h </w:instrText>
+            </w:r>
+            <w:r>
+              <w:rPr>
+                <w:noProof/>
+                <w:webHidden/>
+              </w:rPr>
+            </w:r>
+            <w:r>
+              <w:rPr>
+                <w:noProof/>
+                <w:webHidden/>
+              </w:rPr>
+              <w:fldChar w:fldCharType="separate"/>
+            </w:r>
+            <w:r>
+              <w:rPr>
+                <w:noProof/>
+                <w:webHidden/>
+              </w:rPr>
+              <w:t>9</w:t>
+            </w:r>
+            <w:r>
+              <w:rPr>
+                <w:noProof/>
+                <w:webHidden/>
+              </w:rPr>
+              <w:fldChar w:fldCharType="end"/>
+            </w:r>
+          </w:hyperlink>
+        </w:p>
+        <w:p>
+          <w:pPr>
+            <w:pStyle w:val="Inhopg1"/>
+            <w:tabs>
+              <w:tab w:val="right" w:leader="dot" w:pos="9062"/>
+            </w:tabs>
+            <w:rPr>
+              <w:rFonts w:eastAsiaTheme="minorEastAsia"/>
+              <w:noProof/>
+              <w:sz w:val="24"/>
+              <w:lang w:eastAsia="nl-NL"/>
+            </w:rPr>
+          </w:pPr>
+          <w:hyperlink w:anchor="_Toc229247801" w:history="1">
             <w:r>
               <w:rPr>
                 <w:rStyle w:val="Hyperlink"/>
@@ -1088,7 +1230,7 @@
                 <w:noProof/>
                 <w:webHidden/>
               </w:rPr>
-              <w:instrText xml:space="preserve"> PAGEREF _Toc229165833 \h </w:instrText>
+              <w:instrText xml:space="preserve"> PAGEREF _Toc229247801 \h </w:instrText>
             </w:r>
             <w:r>
               <w:rPr>
@@ -1108,7 +1250,7 @@
                 <w:noProof/>
                 <w:webHidden/>
               </w:rPr>
-              <w:t>7</w:t>
+              <w:t>9</w:t>
             </w:r>
             <w:r>
               <w:rPr>
@@ -1132,7 +1274,7 @@
               <w:lang w:eastAsia="nl-NL"/>
             </w:rPr>
           </w:pPr>
-          <w:hyperlink w:anchor="_Toc229165834" w:history="1">
+          <w:hyperlink w:anchor="_Toc229247802" w:history="1">
             <w:r>
               <w:rPr>
                 <w:rStyle w:val="Hyperlink"/>
@@ -1159,7 +1301,7 @@
                 <w:noProof/>
                 <w:webHidden/>
               </w:rPr>
-              <w:instrText xml:space="preserve"> PAGEREF _Toc229165834 \h </w:instrText>
+              <w:instrText xml:space="preserve"> PAGEREF _Toc229247802 \h </w:instrText>
             </w:r>
             <w:r>
               <w:rPr>
@@ -1179,7 +1321,7 @@
                 <w:noProof/>
                 <w:webHidden/>
               </w:rPr>
-              <w:t>8</w:t>
+              <w:t>10</w:t>
             </w:r>
             <w:r>
               <w:rPr>
@@ -1203,7 +1345,7 @@
               <w:lang w:eastAsia="nl-NL"/>
             </w:rPr>
           </w:pPr>
-          <w:hyperlink w:anchor="_Toc229165835" w:history="1">
+          <w:hyperlink w:anchor="_Toc229247803" w:history="1">
             <w:r>
               <w:rPr>
                 <w:rStyle w:val="Hyperlink"/>
@@ -1230,7 +1372,7 @@
                 <w:noProof/>
                 <w:webHidden/>
               </w:rPr>
-              <w:instrText xml:space="preserve"> PAGEREF _Toc229165835 \h </w:instrText>
+              <w:instrText xml:space="preserve"> PAGEREF _Toc229247803 \h </w:instrText>
             </w:r>
             <w:r>
               <w:rPr>
@@ -1250,7 +1392,7 @@
                 <w:noProof/>
                 <w:webHidden/>
               </w:rPr>
-              <w:t>8</w:t>
+              <w:t>10</w:t>
             </w:r>
             <w:r>
               <w:rPr>
@@ -1274,7 +1416,7 @@
               <w:lang w:eastAsia="nl-NL"/>
             </w:rPr>
           </w:pPr>
-          <w:hyperlink w:anchor="_Toc229165836" w:history="1">
+          <w:hyperlink w:anchor="_Toc229247804" w:history="1">
             <w:r>
               <w:rPr>
                 <w:rStyle w:val="Hyperlink"/>
@@ -1301,7 +1443,7 @@
                 <w:noProof/>
                 <w:webHidden/>
               </w:rPr>
-              <w:instrText xml:space="preserve"> PAGEREF _Toc229165836 \h </w:instrText>
+              <w:instrText xml:space="preserve"> PAGEREF _Toc229247804 \h </w:instrText>
             </w:r>
             <w:r>
               <w:rPr>
@@ -1321,7 +1463,7 @@
                 <w:noProof/>
                 <w:webHidden/>
               </w:rPr>
-              <w:t>8</w:t>
+              <w:t>10</w:t>
             </w:r>
             <w:r>
               <w:rPr>
@@ -1355,12 +1497,11 @@
     <w:p/>
     <w:p/>
     <w:p/>
-    <w:p/>
     <w:p>
       <w:pPr>
         <w:pStyle w:val="Titel"/>
       </w:pPr>
-      <w:bookmarkStart w:id="0" w:name="_Toc229165826"/>
+      <w:bookmarkStart w:id="0" w:name="_Toc229247792"/>
       <w:r>
         <w:t xml:space="preserve">1. </w:t>
       </w:r>
@@ -1373,7 +1514,7 @@
       <w:pPr>
         <w:pStyle w:val="Kop1"/>
       </w:pPr>
-      <w:bookmarkStart w:id="1" w:name="_Toc229165827"/>
+      <w:bookmarkStart w:id="1" w:name="_Toc229247793"/>
       <w:r>
         <w:t xml:space="preserve">1.1 – </w:t>
       </w:r>
@@ -1397,7 +1538,7 @@
       <w:pPr>
         <w:pStyle w:val="Kop1"/>
       </w:pPr>
-      <w:bookmarkStart w:id="2" w:name="_Toc229165828"/>
+      <w:bookmarkStart w:id="2" w:name="_Toc229247794"/>
       <w:r>
         <w:t xml:space="preserve">1.2 – </w:t>
       </w:r>
@@ -1461,7 +1602,7 @@
       <w:pPr>
         <w:pStyle w:val="Kop1"/>
       </w:pPr>
-      <w:bookmarkStart w:id="3" w:name="_Toc229165829"/>
+      <w:bookmarkStart w:id="3" w:name="_Toc229247795"/>
       <w:r>
         <w:t>1.</w:t>
       </w:r>
@@ -1634,7 +1775,7 @@
       <w:pPr>
         <w:pStyle w:val="Titel"/>
       </w:pPr>
-      <w:bookmarkStart w:id="4" w:name="_Toc229165830"/>
+      <w:bookmarkStart w:id="4" w:name="_Toc229247796"/>
       <w:r>
         <w:t xml:space="preserve">2. </w:t>
       </w:r>
@@ -1647,7 +1788,7 @@
       <w:pPr>
         <w:pStyle w:val="Kop1"/>
       </w:pPr>
-      <w:bookmarkStart w:id="5" w:name="_Toc229165831"/>
+      <w:bookmarkStart w:id="5" w:name="_Toc229247797"/>
       <w:r>
         <w:t>2</w:t>
       </w:r>
@@ -1655,13 +1796,606 @@
         <w:t xml:space="preserve">.1 – </w:t>
       </w:r>
       <w:r>
-        <w:t>x</w:t>
+        <w:t>Relatie tussen energieverbruik en CO2-uitstoot</w:t>
       </w:r>
       <w:bookmarkEnd w:id="5"/>
     </w:p>
     <w:p>
       <w:r>
-        <w:t>[Hier komt de analyse]</w:t>
+        <w:t>In deze analyse wordt onderzocht welke factor de sterkste relatie heeft met CO2-uitstoot per capita. Hiervoor zijn GDP per capita en energy per capita vergeleken met CO2-uitstoot per capita.</w:t>
+      </w:r>
+      <w:r>
+        <w:br/>
+      </w:r>
+    </w:p>
+    <w:p>
+      <w:r>
+        <w:t>De gegevens zijn afkomstig uit de dataset van Our World in Data. Voor de analyse zijn alleen de benodigde kolommen geselecteerd. Vervolgens is de dataset opgeschoond door rijen met ontbrekende waarden te verwijderen. Daarna is GDP per capita berekend door het totale GDP te delen door de populatie.</w:t>
+      </w:r>
+      <w:r>
+        <w:br/>
+      </w:r>
+    </w:p>
+    <w:p>
+      <w:pPr>
+        <w:rPr>
+          <w:b/>
+          <w:bCs/>
+        </w:rPr>
+      </w:pPr>
+      <w:r>
+        <w:rPr>
+          <w:b/>
+          <w:bCs/>
+        </w:rPr>
+        <w:t>Om de relatie tussen de variabelen te onderzoeken, is een correlatieanalyse uitgevoerd tussen:</w:t>
+      </w:r>
+    </w:p>
+    <w:p>
+      <w:pPr>
+        <w:pStyle w:val="Lijstalinea"/>
+        <w:numPr>
+          <w:ilvl w:val="0"/>
+          <w:numId w:val="148"/>
+        </w:numPr>
+      </w:pPr>
+      <w:r>
+        <w:t>CO2-uitstoot per capita</w:t>
+      </w:r>
+    </w:p>
+    <w:p>
+      <w:pPr>
+        <w:pStyle w:val="Lijstalinea"/>
+        <w:numPr>
+          <w:ilvl w:val="0"/>
+          <w:numId w:val="148"/>
+        </w:numPr>
+      </w:pPr>
+      <w:r>
+        <w:t>energy per capita</w:t>
+      </w:r>
+    </w:p>
+    <w:p>
+      <w:pPr>
+        <w:pStyle w:val="Lijstalinea"/>
+        <w:numPr>
+          <w:ilvl w:val="0"/>
+          <w:numId w:val="148"/>
+        </w:numPr>
+      </w:pPr>
+      <w:r>
+        <w:t>GDP per capita</w:t>
+      </w:r>
+    </w:p>
+    <w:p/>
+    <w:p>
+      <w:r>
+        <w:t>Uit de correlatieanalyse blijkt dat energy per capita de sterkste positieve relatie heeft met CO2-uitstoot per capita. De correlatie bedraagt ongeveer 0.73. Dit betekent dat landen met een hoger energieverbruik per persoon gemiddeld ook een hogere CO2-uitstoot per persoon hebben.</w:t>
+      </w:r>
+      <w:r>
+        <w:br/>
+      </w:r>
+    </w:p>
+    <w:p>
+      <w:r>
+        <w:rPr>
+          <w:noProof/>
+        </w:rPr>
+        <mc:AlternateContent>
+          <mc:Choice Requires="wps">
+            <w:drawing>
+              <wp:anchor distT="0" distB="0" distL="114300" distR="114300" simplePos="0" relativeHeight="251665408" behindDoc="0" locked="0" layoutInCell="1" allowOverlap="1" wp14:anchorId="1479141A" wp14:editId="6C73D4BE">
+                <wp:simplePos x="0" y="0"/>
+                <wp:positionH relativeFrom="column">
+                  <wp:posOffset>-22860</wp:posOffset>
+                </wp:positionH>
+                <wp:positionV relativeFrom="paragraph">
+                  <wp:posOffset>1449070</wp:posOffset>
+                </wp:positionV>
+                <wp:extent cx="4877435" cy="635"/>
+                <wp:effectExtent l="0" t="0" r="0" b="0"/>
+                <wp:wrapNone/>
+                <wp:docPr id="1662367961" name="Tekstvak 1"/>
+                <wp:cNvGraphicFramePr/>
+                <a:graphic xmlns:a="http://schemas.openxmlformats.org/drawingml/2006/main">
+                  <a:graphicData uri="http://schemas.microsoft.com/office/word/2010/wordprocessingShape">
+                    <wps:wsp>
+                      <wps:cNvSpPr txBox="1"/>
+                      <wps:spPr>
+                        <a:xfrm>
+                          <a:off x="0" y="0"/>
+                          <a:ext cx="4877435" cy="635"/>
+                        </a:xfrm>
+                        <a:prstGeom prst="rect">
+                          <a:avLst/>
+                        </a:prstGeom>
+                        <a:solidFill>
+                          <a:prstClr val="white"/>
+                        </a:solidFill>
+                        <a:ln>
+                          <a:noFill/>
+                        </a:ln>
+                      </wps:spPr>
+                      <wps:txbx>
+                        <w:txbxContent>
+                          <w:p>
+                            <w:pPr>
+                              <w:pStyle w:val="Bijschrift"/>
+                              <w:rPr>
+                                <w:i w:val="0"/>
+                                <w:iCs w:val="0"/>
+                                <w:noProof/>
+                                <w:sz w:val="32"/>
+                                <w:szCs w:val="20"/>
+                              </w:rPr>
+                            </w:pPr>
+                            <w:r>
+                              <w:rPr>
+                                <w:b/>
+                                <w:bCs/>
+                                <w:i w:val="0"/>
+                                <w:iCs w:val="0"/>
+                                <w:sz w:val="20"/>
+                                <w:szCs w:val="20"/>
+                              </w:rPr>
+                              <w:t xml:space="preserve">Figuur </w:t>
+                            </w:r>
+                            <w:r>
+                              <w:rPr>
+                                <w:b/>
+                                <w:bCs/>
+                                <w:i w:val="0"/>
+                                <w:iCs w:val="0"/>
+                                <w:sz w:val="20"/>
+                                <w:szCs w:val="20"/>
+                              </w:rPr>
+                              <w:fldChar w:fldCharType="begin"/>
+                            </w:r>
+                            <w:r>
+                              <w:rPr>
+                                <w:b/>
+                                <w:bCs/>
+                                <w:i w:val="0"/>
+                                <w:iCs w:val="0"/>
+                                <w:sz w:val="20"/>
+                                <w:szCs w:val="20"/>
+                              </w:rPr>
+                              <w:instrText xml:space="preserve"> SEQ Figuur \* ARABIC </w:instrText>
+                            </w:r>
+                            <w:r>
+                              <w:rPr>
+                                <w:b/>
+                                <w:bCs/>
+                                <w:i w:val="0"/>
+                                <w:iCs w:val="0"/>
+                                <w:sz w:val="20"/>
+                                <w:szCs w:val="20"/>
+                              </w:rPr>
+                              <w:fldChar w:fldCharType="separate"/>
+                            </w:r>
+                            <w:r>
+                              <w:rPr>
+                                <w:b/>
+                                <w:bCs/>
+                                <w:i w:val="0"/>
+                                <w:iCs w:val="0"/>
+                                <w:noProof/>
+                                <w:sz w:val="20"/>
+                                <w:szCs w:val="20"/>
+                              </w:rPr>
+                              <w:t>1</w:t>
+                            </w:r>
+                            <w:r>
+                              <w:rPr>
+                                <w:b/>
+                                <w:bCs/>
+                                <w:i w:val="0"/>
+                                <w:iCs w:val="0"/>
+                                <w:sz w:val="20"/>
+                                <w:szCs w:val="20"/>
+                              </w:rPr>
+                              <w:fldChar w:fldCharType="end"/>
+                            </w:r>
+                            <w:r>
+                              <w:rPr>
+                                <w:i w:val="0"/>
+                                <w:iCs w:val="0"/>
+                                <w:sz w:val="20"/>
+                                <w:szCs w:val="20"/>
+                              </w:rPr>
+                              <w:t xml:space="preserve"> toont de correlatiematrix van CO2-uitstoot per capita, energy per capita en GDP per capita. Hieruit blijkt dat energy per capita de sterkste relatie heeft met CO2-uitstoot per capita.</w:t>
+                            </w:r>
+                          </w:p>
+                        </w:txbxContent>
+                      </wps:txbx>
+                      <wps:bodyPr rot="0" spcFirstLastPara="0" vertOverflow="overflow" horzOverflow="overflow" vert="horz" wrap="square" lIns="0" tIns="0" rIns="0" bIns="0" numCol="1" spcCol="0" rtlCol="0" fromWordArt="0" anchor="t" anchorCtr="0" forceAA="0" compatLnSpc="1">
+                        <a:prstTxWarp prst="textNoShape">
+                          <a:avLst/>
+                        </a:prstTxWarp>
+                        <a:spAutoFit/>
+                      </wps:bodyPr>
+                    </wps:wsp>
+                  </a:graphicData>
+                </a:graphic>
+              </wp:anchor>
+            </w:drawing>
+          </mc:Choice>
+          <mc:Fallback>
+            <w:pict>
+              <v:shape w14:anchorId="1479141A" id="Tekstvak 1" o:spid="_x0000_s1027" type="#_x0000_t202" style="position:absolute;margin-left:-1.8pt;margin-top:114.1pt;width:384.05pt;height:.05pt;z-index:251665408;visibility:visible;mso-wrap-style:square;mso-wrap-distance-left:9pt;mso-wrap-distance-top:0;mso-wrap-distance-right:9pt;mso-wrap-distance-bottom:0;mso-position-horizontal:absolute;mso-position-horizontal-relative:text;mso-position-vertical:absolute;mso-position-vertical-relative:text;v-text-anchor:top" o:gfxdata="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" stroked="f">
+                <v:textbox style="mso-fit-shape-to-text:t" inset="0,0,0,0">
+                  <w:txbxContent>
+                    <w:p>
+                      <w:pPr>
+                        <w:pStyle w:val="Bijschrift"/>
+                        <w:rPr>
+                          <w:i w:val="0"/>
+                          <w:iCs w:val="0"/>
+                          <w:noProof/>
+                          <w:sz w:val="32"/>
+                          <w:szCs w:val="20"/>
+                        </w:rPr>
+                      </w:pPr>
+                      <w:r>
+                        <w:rPr>
+                          <w:b/>
+                          <w:bCs/>
+                          <w:i w:val="0"/>
+                          <w:iCs w:val="0"/>
+                          <w:sz w:val="20"/>
+                          <w:szCs w:val="20"/>
+                        </w:rPr>
+                        <w:t xml:space="preserve">Figuur </w:t>
+                      </w:r>
+                      <w:r>
+                        <w:rPr>
+                          <w:b/>
+                          <w:bCs/>
+                          <w:i w:val="0"/>
+                          <w:iCs w:val="0"/>
+                          <w:sz w:val="20"/>
+                          <w:szCs w:val="20"/>
+                        </w:rPr>
+                        <w:fldChar w:fldCharType="begin"/>
+                      </w:r>
+                      <w:r>
+                        <w:rPr>
+                          <w:b/>
+                          <w:bCs/>
+                          <w:i w:val="0"/>
+                          <w:iCs w:val="0"/>
+                          <w:sz w:val="20"/>
+                          <w:szCs w:val="20"/>
+                        </w:rPr>
+                        <w:instrText xml:space="preserve"> SEQ Figuur \* ARABIC </w:instrText>
+                      </w:r>
+                      <w:r>
+                        <w:rPr>
+                          <w:b/>
+                          <w:bCs/>
+                          <w:i w:val="0"/>
+                          <w:iCs w:val="0"/>
+                          <w:sz w:val="20"/>
+                          <w:szCs w:val="20"/>
+                        </w:rPr>
+                        <w:fldChar w:fldCharType="separate"/>
+                      </w:r>
+                      <w:r>
+                        <w:rPr>
+                          <w:b/>
+                          <w:bCs/>
+                          <w:i w:val="0"/>
+                          <w:iCs w:val="0"/>
+                          <w:noProof/>
+                          <w:sz w:val="20"/>
+                          <w:szCs w:val="20"/>
+                        </w:rPr>
+                        <w:t>1</w:t>
+                      </w:r>
+                      <w:r>
+                        <w:rPr>
+                          <w:b/>
+                          <w:bCs/>
+                          <w:i w:val="0"/>
+                          <w:iCs w:val="0"/>
+                          <w:sz w:val="20"/>
+                          <w:szCs w:val="20"/>
+                        </w:rPr>
+                        <w:fldChar w:fldCharType="end"/>
+                      </w:r>
+                      <w:r>
+                        <w:rPr>
+                          <w:i w:val="0"/>
+                          <w:iCs w:val="0"/>
+                          <w:sz w:val="20"/>
+                          <w:szCs w:val="20"/>
+                        </w:rPr>
+                        <w:t xml:space="preserve"> toont de correlatiematrix van CO2-uitstoot per capita, energy per capita en GDP per capita. Hieruit blijkt dat energy per capita de sterkste relatie heeft met CO2-uitstoot per capita.</w:t>
+                      </w:r>
+                    </w:p>
+                  </w:txbxContent>
+                </v:textbox>
+              </v:shape>
+            </w:pict>
+          </mc:Fallback>
+        </mc:AlternateContent>
+      </w:r>
+      <w:r>
+        <w:rPr>
+          <w:noProof/>
+        </w:rPr>
+        <mc:AlternateContent>
+          <mc:Choice Requires="wpg">
+            <w:drawing>
+              <wp:anchor distT="0" distB="0" distL="114300" distR="114300" simplePos="0" relativeHeight="251663360" behindDoc="0" locked="0" layoutInCell="1" allowOverlap="1" wp14:anchorId="1CD68290" wp14:editId="7073D23E">
+                <wp:simplePos x="0" y="0"/>
+                <wp:positionH relativeFrom="column">
+                  <wp:posOffset>-22860</wp:posOffset>
+                </wp:positionH>
+                <wp:positionV relativeFrom="paragraph">
+                  <wp:posOffset>134737</wp:posOffset>
+                </wp:positionV>
+                <wp:extent cx="4877435" cy="1257300"/>
+                <wp:effectExtent l="0" t="0" r="0" b="0"/>
+                <wp:wrapNone/>
+                <wp:docPr id="396342765" name="Groep 7"/>
+                <wp:cNvGraphicFramePr/>
+                <a:graphic xmlns:a="http://schemas.openxmlformats.org/drawingml/2006/main">
+                  <a:graphicData uri="http://schemas.microsoft.com/office/word/2010/wordprocessingGroup">
+                    <wpg:wgp>
+                      <wpg:cNvGrpSpPr/>
+                      <wpg:grpSpPr>
+                        <a:xfrm>
+                          <a:off x="0" y="0"/>
+                          <a:ext cx="4877435" cy="1257300"/>
+                          <a:chOff x="0" y="0"/>
+                          <a:chExt cx="4877435" cy="1257300"/>
+                        </a:xfrm>
+                      </wpg:grpSpPr>
+                      <pic:pic xmlns:pic="http://schemas.openxmlformats.org/drawingml/2006/picture">
+                        <pic:nvPicPr>
+                          <pic:cNvPr id="66110660" name="Afbeelding 5"/>
+                          <pic:cNvPicPr>
+                            <a:picLocks noChangeAspect="1"/>
+                          </pic:cNvPicPr>
+                        </pic:nvPicPr>
+                        <pic:blipFill>
+                          <a:blip r:embed="rId10">
+                            <a:extLst>
+                              <a:ext uri="{28A0092B-C50C-407E-A947-70E740481C1C}">
+                                <a14:useLocalDpi xmlns:a14="http://schemas.microsoft.com/office/drawing/2010/main" val="0"/>
+                              </a:ext>
+                            </a:extLst>
+                          </a:blip>
+                          <a:stretch>
+                            <a:fillRect/>
+                          </a:stretch>
+                        </pic:blipFill>
+                        <pic:spPr>
+                          <a:xfrm>
+                            <a:off x="0" y="0"/>
+                            <a:ext cx="4877435" cy="1257300"/>
+                          </a:xfrm>
+                          <a:prstGeom prst="rect">
+                            <a:avLst/>
+                          </a:prstGeom>
+                        </pic:spPr>
+                      </pic:pic>
+                      <wps:wsp>
+                        <wps:cNvPr id="562248749" name="Rechthoek 6"/>
+                        <wps:cNvSpPr/>
+                        <wps:spPr>
+                          <a:xfrm>
+                            <a:off x="1670180" y="727787"/>
+                            <a:ext cx="718457" cy="195943"/>
+                          </a:xfrm>
+                          <a:prstGeom prst="rect">
+                            <a:avLst/>
+                          </a:prstGeom>
+                          <a:noFill/>
+                          <a:ln>
+                            <a:solidFill>
+                              <a:srgbClr val="FFC000"/>
+                            </a:solidFill>
+                          </a:ln>
+                        </wps:spPr>
+                        <wps:style>
+                          <a:lnRef idx="2">
+                            <a:schemeClr val="accent1">
+                              <a:shade val="15000"/>
+                            </a:schemeClr>
+                          </a:lnRef>
+                          <a:fillRef idx="1">
+                            <a:schemeClr val="accent1"/>
+                          </a:fillRef>
+                          <a:effectRef idx="0">
+                            <a:schemeClr val="accent1"/>
+                          </a:effectRef>
+                          <a:fontRef idx="minor">
+                            <a:schemeClr val="lt1"/>
+                          </a:fontRef>
+                        </wps:style>
+                        <wps:bodyPr rot="0" spcFirstLastPara="0" vertOverflow="overflow" horzOverflow="overflow" vert="horz" wrap="square" lIns="91440" tIns="45720" rIns="91440" bIns="45720" numCol="1" spcCol="0" rtlCol="0" fromWordArt="0" anchor="ctr" anchorCtr="0" forceAA="0" compatLnSpc="1">
+                          <a:prstTxWarp prst="textNoShape">
+                            <a:avLst/>
+                          </a:prstTxWarp>
+                          <a:noAutofit/>
+                        </wps:bodyPr>
+                      </wps:wsp>
+                    </wpg:wgp>
+                  </a:graphicData>
+                </a:graphic>
+              </wp:anchor>
+            </w:drawing>
+          </mc:Choice>
+          <mc:Fallback>
+            <w:pict>
+              <v:group w14:anchorId="5D139E64" id="Groep 7" o:spid="_x0000_s1026" style="position:absolute;margin-left:-1.8pt;margin-top:10.6pt;width:384.05pt;height:99pt;z-index:251663360" coordsize="48774,12573" o:gfxdata="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">
+                <v:shapetype id="_x0000_t75" coordsize="21600,21600" o:spt="75" o:preferrelative="t" path="m@4@5l@4@11@9@11@9@5xe" filled="f" stroked="f">
+                  <v:stroke joinstyle="miter"/>
+                  <v:formulas>
+                    <v:f eqn="if lineDrawn pixelLineWidth 0"/>
+                    <v:f eqn="sum @0 1 0"/>
+                    <v:f eqn="sum 0 0 @1"/>
+                    <v:f eqn="prod @2 1 2"/>
+                    <v:f eqn="prod @3 21600 pixelWidth"/>
+                    <v:f eqn="prod @3 21600 pixelHeight"/>
+                    <v:f eqn="sum @0 0 1"/>
+                    <v:f eqn="prod @6 1 2"/>
+                    <v:f eqn="prod @7 21600 pixelWidth"/>
+                    <v:f eqn="sum @8 21600 0"/>
+                    <v:f eqn="prod @7 21600 pixelHeight"/>
+                    <v:f eqn="sum @10 21600 0"/>
+                  </v:formulas>
+                  <v:path o:extrusionok="f" gradientshapeok="t" o:connecttype="rect"/>
+                  <o:lock v:ext="edit" aspectratio="t"/>
+                </v:shapetype>
+                <v:shape id="Afbeelding 5" o:spid="_x0000_s1027" type="#_x0000_t75" style="position:absolute;width:48774;height:12573;visibility:visible;mso-wrap-style:square" o:gfxdata="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">
+                  <v:imagedata r:id="rId11" o:title=""/>
+                </v:shape>
+                <v:rect id="Rechthoek 6" o:spid="_x0000_s1028" style="position:absolute;left:16701;top:7277;width:7185;height:1960;visibility:visible;mso-wrap-style:square;v-text-anchor:middle" o:gfxdata="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" filled="f" strokecolor="#ffc000" strokeweight="1.5pt"/>
+              </v:group>
+            </w:pict>
+          </mc:Fallback>
+        </mc:AlternateContent>
+      </w:r>
+    </w:p>
+    <w:p/>
+    <w:p/>
+    <w:p/>
+    <w:p/>
+    <w:p/>
+    <w:p>
+      <w:pPr>
+        <w:pStyle w:val="Kop1"/>
+      </w:pPr>
+      <w:bookmarkStart w:id="6" w:name="_Toc229247798"/>
+      <w:r>
+        <w:t>2.</w:t>
+      </w:r>
+      <w:r>
+        <w:t>2</w:t>
+      </w:r>
+      <w:r>
+        <w:t xml:space="preserve"> – </w:t>
+      </w:r>
+      <w:r>
+        <w:t xml:space="preserve">Landen met grootste daling in </w:t>
+      </w:r>
+      <w:r>
+        <w:t>CO2-uitstoot per capita</w:t>
+      </w:r>
+      <w:bookmarkEnd w:id="6"/>
+    </w:p>
+    <w:p>
+      <w:r>
+        <w:t>In deze analyse wordt onderzocht welke landen de grootste procentuele daling in CO2-uitstoot per capita hebben gerealiseerd sinds 1990.</w:t>
+      </w:r>
+      <w:r>
+        <w:br/>
+      </w:r>
+    </w:p>
+    <w:p>
+      <w:r>
+        <w:t>Er is gekozen voor CO2-uitstoot per capita in plaats van totale CO2-uitstoot, zodat landen eerlijker met elkaar kunnen worden vergeleken. Hierdoor wordt rekening gehouden met verschillen in bevolkingsgrootte.</w:t>
+      </w:r>
+      <w:r>
+        <w:br/>
+      </w:r>
+    </w:p>
+    <w:p>
+      <w:r>
+        <w:t>De gegevens zijn opnieuw opgehaald uit de dataset van Our World in Data. Vervolgens zijn alleen de benodigde kolommen geselecteerd en zijn rijen met ontbrekende waarden verwijderd.</w:t>
+      </w:r>
+      <w:r>
+        <w:br/>
+      </w:r>
+    </w:p>
+    <w:p>
+      <w:pPr>
+        <w:rPr>
+          <w:b/>
+          <w:bCs/>
+        </w:rPr>
+      </w:pPr>
+      <w:r>
+        <w:t>Alleen data vanaf 1990 is gebruikt in de analyse. De dataset bevat gegevens over een zeer lange periode, waarbij sommige landen al data hebben vanaf de 18e of 19e eeuw en andere landen pas veel later gegevens bevatten. Hierdoor ontstaan grote verschillen tussen de periodes die per land worden vergeleken. Door alleen data vanaf 1990 te gebruiken, worden landen over een recentere en beter vergelijkbare periode geanalyseerd.</w:t>
+      </w:r>
+      <w:r>
+        <w:br/>
+      </w:r>
+      <w:r>
+        <w:br/>
+      </w:r>
+      <w:r>
+        <w:rPr>
+          <w:b/>
+          <w:bCs/>
+        </w:rPr>
+        <w:t>Voor ieder land is daarna gekeken naar:</w:t>
+      </w:r>
+    </w:p>
+    <w:p>
+      <w:pPr>
+        <w:pStyle w:val="Lijstalinea"/>
+        <w:numPr>
+          <w:ilvl w:val="0"/>
+          <w:numId w:val="150"/>
+        </w:numPr>
+      </w:pPr>
+      <w:r>
+        <w:t>de eerste beschikbare waarde van CO2-uitstoot per capita vanaf 1990</w:t>
+      </w:r>
+    </w:p>
+    <w:p>
+      <w:pPr>
+        <w:pStyle w:val="Lijstalinea"/>
+        <w:numPr>
+          <w:ilvl w:val="0"/>
+          <w:numId w:val="150"/>
+        </w:numPr>
+      </w:pPr>
+      <w:r>
+        <w:t>de laatste beschikbare waarde van CO2-uitstoot per capita</w:t>
+      </w:r>
+    </w:p>
+    <w:p/>
+    <w:p>
+      <w:r>
+        <w:t xml:space="preserve">Met deze waarden is vervolgens de procentuele verandering berekend. Hierdoor kon worden bepaald welke landen de grootste afname in </w:t>
+      </w:r>
+      <w:r>
+        <w:t>CO2-uitstoot per capita</w:t>
+      </w:r>
+      <w:r>
+        <w:t xml:space="preserve"> hebben gerealiseerd.</w:t>
+      </w:r>
+      <w:r>
+        <w:t xml:space="preserve"> </w:t>
+      </w:r>
+      <w:r>
+        <w:br/>
+      </w:r>
+      <w:r>
+        <w:br/>
+      </w:r>
+      <w:r>
+        <w:t>Uit de analyse blijkt dat landen zoals Moldova, Estonia, Ukraine en Luxembourg de grootste procentuele daling in CO2-uitstoot per capita hebben gerealiseerd.</w:t>
+      </w:r>
+      <w:r>
+        <w:br/>
+      </w:r>
+    </w:p>
+    <w:p>
+      <w:r>
+        <w:t>De grafiek laat zien dat sommige landen een daling van meer dan 70% hebben bereikt.</w:t>
+      </w:r>
+      <w:r>
+        <w:rPr>
+          <w:b/>
+          <w:bCs/>
+        </w:rPr>
+        <w:t xml:space="preserve"> </w:t>
       </w:r>
       <w:r>
         <w:rPr>
@@ -1670,15 +2404,20 @@
         </w:rPr>
         <w:br/>
       </w:r>
+    </w:p>
+    <w:p>
+      <w:pPr>
+        <w:keepNext/>
+      </w:pPr>
       <w:r>
         <w:rPr>
           <w:noProof/>
         </w:rPr>
         <w:drawing>
-          <wp:inline distT="0" distB="0" distL="0" distR="0" wp14:anchorId="3520C4B2" wp14:editId="33123A62">
-            <wp:extent cx="5760720" cy="2901315"/>
+          <wp:inline distT="0" distB="0" distL="0" distR="0" wp14:anchorId="6CBC3DE2" wp14:editId="0BA9D582">
+            <wp:extent cx="6382139" cy="3829285"/>
             <wp:effectExtent l="0" t="0" r="0" b="0"/>
-            <wp:docPr id="926634137" name="Afbeelding 6"/>
+            <wp:docPr id="1280696176" name="Afbeelding 8"/>
             <wp:cNvGraphicFramePr>
               <a:graphicFrameLocks xmlns:a="http://schemas.openxmlformats.org/drawingml/2006/main" noChangeAspect="1"/>
             </wp:cNvGraphicFramePr>
@@ -1686,11 +2425,11 @@
               <a:graphicData uri="http://schemas.openxmlformats.org/drawingml/2006/picture">
                 <pic:pic xmlns:pic="http://schemas.openxmlformats.org/drawingml/2006/picture">
                   <pic:nvPicPr>
-                    <pic:cNvPr id="926634137" name="Afbeelding 926634137"/>
+                    <pic:cNvPr id="1280696176" name="Afbeelding 8"/>
                     <pic:cNvPicPr/>
                   </pic:nvPicPr>
                   <pic:blipFill>
-                    <a:blip r:embed="rId10" cstate="print">
+                    <a:blip r:embed="rId12">
                       <a:extLst>
                         <a:ext uri="{28A0092B-C50C-407E-A947-70E740481C1C}">
                           <a14:useLocalDpi xmlns:a14="http://schemas.microsoft.com/office/drawing/2010/main" val="0"/>
@@ -1704,7 +2443,7 @@
                   <pic:spPr>
                     <a:xfrm>
                       <a:off x="0" y="0"/>
-                      <a:ext cx="5760720" cy="2901315"/>
+                      <a:ext cx="6413814" cy="3848290"/>
                     </a:xfrm>
                     <a:prstGeom prst="rect">
                       <a:avLst/>
@@ -1716,15 +2455,135 @@
           </wp:inline>
         </w:drawing>
       </w:r>
+    </w:p>
+    <w:p>
+      <w:pPr>
+        <w:pStyle w:val="Bijschrift"/>
+        <w:rPr>
+          <w:i w:val="0"/>
+          <w:iCs w:val="0"/>
+          <w:sz w:val="20"/>
+          <w:szCs w:val="20"/>
+        </w:rPr>
+      </w:pPr>
+      <w:r>
+        <w:rPr>
+          <w:b/>
+          <w:bCs/>
+          <w:i w:val="0"/>
+          <w:iCs w:val="0"/>
+          <w:sz w:val="20"/>
+          <w:szCs w:val="20"/>
+        </w:rPr>
+        <w:t xml:space="preserve">Figuur </w:t>
+      </w:r>
+      <w:r>
+        <w:rPr>
+          <w:b/>
+          <w:bCs/>
+          <w:i w:val="0"/>
+          <w:iCs w:val="0"/>
+          <w:sz w:val="20"/>
+          <w:szCs w:val="20"/>
+        </w:rPr>
+        <w:fldChar w:fldCharType="begin"/>
+      </w:r>
+      <w:r>
+        <w:rPr>
+          <w:b/>
+          <w:bCs/>
+          <w:i w:val="0"/>
+          <w:iCs w:val="0"/>
+          <w:sz w:val="20"/>
+          <w:szCs w:val="20"/>
+        </w:rPr>
+        <w:instrText xml:space="preserve"> SEQ Figuur \* ARABIC </w:instrText>
+      </w:r>
+      <w:r>
+        <w:rPr>
+          <w:b/>
+          <w:bCs/>
+          <w:i w:val="0"/>
+          <w:iCs w:val="0"/>
+          <w:sz w:val="20"/>
+          <w:szCs w:val="20"/>
+        </w:rPr>
+        <w:fldChar w:fldCharType="separate"/>
+      </w:r>
+      <w:r>
+        <w:rPr>
+          <w:b/>
+          <w:bCs/>
+          <w:i w:val="0"/>
+          <w:iCs w:val="0"/>
+          <w:noProof/>
+          <w:sz w:val="20"/>
+          <w:szCs w:val="20"/>
+        </w:rPr>
+        <w:t>2</w:t>
+      </w:r>
+      <w:r>
+        <w:rPr>
+          <w:b/>
+          <w:bCs/>
+          <w:i w:val="0"/>
+          <w:iCs w:val="0"/>
+          <w:sz w:val="20"/>
+          <w:szCs w:val="20"/>
+        </w:rPr>
+        <w:fldChar w:fldCharType="end"/>
+      </w:r>
+      <w:r>
+        <w:rPr>
+          <w:i w:val="0"/>
+          <w:iCs w:val="0"/>
+          <w:sz w:val="20"/>
+          <w:szCs w:val="20"/>
+        </w:rPr>
+        <w:t xml:space="preserve"> laat zien welke landen sinds 1990 de grootste procentuele daling in CO2-uitstoot per capita hebben gerealiseerd. Moldova en Estonia behoren tot de sterkste dalers.</w:t>
+      </w:r>
+    </w:p>
+    <w:p>
+      <w:pPr>
+        <w:pStyle w:val="Kop1"/>
+      </w:pPr>
+      <w:r>
+        <w:br/>
+      </w:r>
+      <w:bookmarkStart w:id="7" w:name="_Toc229247799"/>
+      <w:r>
+        <w:t xml:space="preserve">2.3 – </w:t>
+      </w:r>
+      <w:r>
+        <w:t>Verwachte groei van duurzame energiebronnen</w:t>
+      </w:r>
+      <w:bookmarkEnd w:id="7"/>
+    </w:p>
+    <w:p/>
+    <w:p/>
+    <w:p/>
+    <w:p/>
+    <w:p/>
+    <w:p/>
+    <w:p/>
+    <w:p>
       <w:r>
         <w:rPr>
           <w:noProof/>
         </w:rPr>
         <w:drawing>
-          <wp:inline distT="0" distB="0" distL="0" distR="0" wp14:anchorId="30C83DCA" wp14:editId="2955DD4E">
-            <wp:extent cx="5760720" cy="2901315"/>
-            <wp:effectExtent l="0" t="0" r="0" b="0"/>
-            <wp:docPr id="1083592999" name="Afbeelding 7"/>
+          <wp:anchor distT="0" distB="0" distL="114300" distR="114300" simplePos="0" relativeHeight="251667456" behindDoc="1" locked="0" layoutInCell="1" allowOverlap="1" wp14:anchorId="77BBAF05" wp14:editId="763649A6">
+            <wp:simplePos x="0" y="0"/>
+            <wp:positionH relativeFrom="column">
+              <wp:posOffset>-125095</wp:posOffset>
+            </wp:positionH>
+            <wp:positionV relativeFrom="paragraph">
+              <wp:posOffset>196681</wp:posOffset>
+            </wp:positionV>
+            <wp:extent cx="4835524" cy="2901315"/>
+            <wp:effectExtent l="0" t="0" r="3810" b="0"/>
+            <wp:wrapNone/>
+            <wp:docPr id="1135620991" name="Afbeelding 9"/>
             <wp:cNvGraphicFramePr>
               <a:graphicFrameLocks xmlns:a="http://schemas.openxmlformats.org/drawingml/2006/main" noChangeAspect="1"/>
             </wp:cNvGraphicFramePr>
@@ -1732,11 +2591,11 @@
               <a:graphicData uri="http://schemas.openxmlformats.org/drawingml/2006/picture">
                 <pic:pic xmlns:pic="http://schemas.openxmlformats.org/drawingml/2006/picture">
                   <pic:nvPicPr>
-                    <pic:cNvPr id="1083592999" name="Afbeelding 1083592999"/>
+                    <pic:cNvPr id="1135620991" name="Afbeelding 9"/>
                     <pic:cNvPicPr/>
                   </pic:nvPicPr>
                   <pic:blipFill>
-                    <a:blip r:embed="rId11" cstate="print">
+                    <a:blip r:embed="rId13">
                       <a:extLst>
                         <a:ext uri="{28A0092B-C50C-407E-A947-70E740481C1C}">
                           <a14:useLocalDpi xmlns:a14="http://schemas.microsoft.com/office/drawing/2010/main" val="0"/>
@@ -1750,7 +2609,7 @@
                   <pic:spPr>
                     <a:xfrm>
                       <a:off x="0" y="0"/>
-                      <a:ext cx="5760720" cy="2901315"/>
+                      <a:ext cx="4835524" cy="2901315"/>
                     </a:xfrm>
                     <a:prstGeom prst="rect">
                       <a:avLst/>
@@ -1759,99 +2618,7 @@
                 </pic:pic>
               </a:graphicData>
             </a:graphic>
-          </wp:inline>
-        </w:drawing>
-      </w:r>
-      <w:r>
-        <w:rPr>
-          <w:noProof/>
-        </w:rPr>
-        <w:drawing>
-          <wp:inline distT="0" distB="0" distL="0" distR="0" wp14:anchorId="2FACF298" wp14:editId="5CEE0A69">
-            <wp:extent cx="5760720" cy="2901315"/>
-            <wp:effectExtent l="0" t="0" r="0" b="0"/>
-            <wp:docPr id="1280696176" name="Afbeelding 8"/>
-            <wp:cNvGraphicFramePr>
-              <a:graphicFrameLocks xmlns:a="http://schemas.openxmlformats.org/drawingml/2006/main" noChangeAspect="1"/>
-            </wp:cNvGraphicFramePr>
-            <a:graphic xmlns:a="http://schemas.openxmlformats.org/drawingml/2006/main">
-              <a:graphicData uri="http://schemas.openxmlformats.org/drawingml/2006/picture">
-                <pic:pic xmlns:pic="http://schemas.openxmlformats.org/drawingml/2006/picture">
-                  <pic:nvPicPr>
-                    <pic:cNvPr id="1280696176" name="Afbeelding 1280696176"/>
-                    <pic:cNvPicPr/>
-                  </pic:nvPicPr>
-                  <pic:blipFill>
-                    <a:blip r:embed="rId12" cstate="print">
-                      <a:extLst>
-                        <a:ext uri="{28A0092B-C50C-407E-A947-70E740481C1C}">
-                          <a14:useLocalDpi xmlns:a14="http://schemas.microsoft.com/office/drawing/2010/main" val="0"/>
-                        </a:ext>
-                      </a:extLst>
-                    </a:blip>
-                    <a:stretch>
-                      <a:fillRect/>
-                    </a:stretch>
-                  </pic:blipFill>
-                  <pic:spPr>
-                    <a:xfrm>
-                      <a:off x="0" y="0"/>
-                      <a:ext cx="5760720" cy="2901315"/>
-                    </a:xfrm>
-                    <a:prstGeom prst="rect">
-                      <a:avLst/>
-                    </a:prstGeom>
-                  </pic:spPr>
-                </pic:pic>
-              </a:graphicData>
-            </a:graphic>
-          </wp:inline>
-        </w:drawing>
-      </w:r>
-      <w:r>
-        <w:rPr>
-          <w:noProof/>
-        </w:rPr>
-        <w:drawing>
-          <wp:inline distT="0" distB="0" distL="0" distR="0" wp14:anchorId="3CBF856F" wp14:editId="57DD395A">
-            <wp:extent cx="5760720" cy="2901315"/>
-            <wp:effectExtent l="0" t="0" r="0" b="0"/>
-            <wp:docPr id="1135620991" name="Afbeelding 9"/>
-            <wp:cNvGraphicFramePr>
-              <a:graphicFrameLocks xmlns:a="http://schemas.openxmlformats.org/drawingml/2006/main" noChangeAspect="1"/>
-            </wp:cNvGraphicFramePr>
-            <a:graphic xmlns:a="http://schemas.openxmlformats.org/drawingml/2006/main">
-              <a:graphicData uri="http://schemas.openxmlformats.org/drawingml/2006/picture">
-                <pic:pic xmlns:pic="http://schemas.openxmlformats.org/drawingml/2006/picture">
-                  <pic:nvPicPr>
-                    <pic:cNvPr id="1135620991" name="Afbeelding 1135620991"/>
-                    <pic:cNvPicPr/>
-                  </pic:nvPicPr>
-                  <pic:blipFill>
-                    <a:blip r:embed="rId13" cstate="print">
-                      <a:extLst>
-                        <a:ext uri="{28A0092B-C50C-407E-A947-70E740481C1C}">
-                          <a14:useLocalDpi xmlns:a14="http://schemas.microsoft.com/office/drawing/2010/main" val="0"/>
-                        </a:ext>
-                      </a:extLst>
-                    </a:blip>
-                    <a:stretch>
-                      <a:fillRect/>
-                    </a:stretch>
-                  </pic:blipFill>
-                  <pic:spPr>
-                    <a:xfrm>
-                      <a:off x="0" y="0"/>
-                      <a:ext cx="5760720" cy="2901315"/>
-                    </a:xfrm>
-                    <a:prstGeom prst="rect">
-                      <a:avLst/>
-                    </a:prstGeom>
-                  </pic:spPr>
-                </pic:pic>
-              </a:graphicData>
-            </a:graphic>
-          </wp:inline>
+          </wp:anchor>
         </w:drawing>
       </w:r>
     </w:p>
@@ -1868,20 +2635,20 @@
       <w:pPr>
         <w:pStyle w:val="Titel"/>
       </w:pPr>
-      <w:bookmarkStart w:id="6" w:name="_Toc229165832"/>
+      <w:bookmarkStart w:id="8" w:name="_Toc229247800"/>
       <w:r>
         <w:t xml:space="preserve">3. </w:t>
       </w:r>
       <w:r>
         <w:t>Conclusie</w:t>
       </w:r>
-      <w:bookmarkEnd w:id="6"/>
+      <w:bookmarkEnd w:id="8"/>
     </w:p>
     <w:p>
       <w:pPr>
         <w:pStyle w:val="Kop1"/>
       </w:pPr>
-      <w:bookmarkStart w:id="7" w:name="_Toc229165833"/>
+      <w:bookmarkStart w:id="9" w:name="_Toc229247801"/>
       <w:r>
         <w:t>3</w:t>
       </w:r>
@@ -1891,7 +2658,7 @@
       <w:r>
         <w:t>x</w:t>
       </w:r>
-      <w:bookmarkEnd w:id="7"/>
+      <w:bookmarkEnd w:id="9"/>
     </w:p>
     <w:p>
       <w:r>
@@ -1904,25 +2671,25 @@
       <w:pPr>
         <w:pStyle w:val="Titel"/>
       </w:pPr>
-      <w:bookmarkStart w:id="8" w:name="_Toc229165834"/>
+      <w:bookmarkStart w:id="10" w:name="_Toc229247802"/>
       <w:r>
         <w:t xml:space="preserve">4. </w:t>
       </w:r>
       <w:r>
         <w:t>Appendix</w:t>
       </w:r>
-      <w:bookmarkEnd w:id="8"/>
+      <w:bookmarkEnd w:id="10"/>
     </w:p>
     <w:p/>
     <w:p>
-      <w:bookmarkStart w:id="9" w:name="_Toc229165835"/>
+      <w:bookmarkStart w:id="11" w:name="_Toc229247803"/>
       <w:r>
         <w:rPr>
           <w:rStyle w:val="Kop1Char"/>
         </w:rPr>
         <w:t>4.1 Python-code</w:t>
       </w:r>
-      <w:bookmarkEnd w:id="9"/>
+      <w:bookmarkEnd w:id="11"/>
       <w:r>
         <w:br/>
         <w:t xml:space="preserve">De volledige Python-code </w:t>
@@ -1976,14 +2743,14 @@
           <w:bCs/>
         </w:rPr>
       </w:pPr>
-      <w:bookmarkStart w:id="10" w:name="_Toc229165836"/>
+      <w:bookmarkStart w:id="12" w:name="_Toc229247804"/>
       <w:r>
         <w:rPr>
           <w:rStyle w:val="Kop1Char"/>
         </w:rPr>
         <w:t>4.2 Gebruikte datasets</w:t>
       </w:r>
-      <w:bookmarkEnd w:id="10"/>
+      <w:bookmarkEnd w:id="12"/>
       <w:r>
         <w:rPr>
           <w:rStyle w:val="Kop1Char"/>
@@ -5417,6 +6184,119 @@
     </w:lvl>
   </w:abstractNum>
   <w:abstractNum w:abstractNumId="26" w15:restartNumberingAfterBreak="0">
+    <w:nsid w:val="1AA855B4"/>
+    <w:multiLevelType w:val="hybridMultilevel"/>
+    <w:tmpl w:val="61D23BE4"/>
+    <w:lvl w:ilvl="0" w:tplc="04130001">
+      <w:start w:val="1"/>
+      <w:numFmt w:val="bullet"/>
+      <w:lvlText w:val=""/>
+      <w:lvlJc w:val="left"/>
+      <w:pPr>
+        <w:ind w:left="720" w:hanging="360"/>
+      </w:pPr>
+      <w:rPr>
+        <w:rFonts w:ascii="Symbol" w:hAnsi="Symbol" w:hint="default"/>
+      </w:rPr>
+    </w:lvl>
+    <w:lvl w:ilvl="1" w:tplc="04130003" w:tentative="1">
+      <w:start w:val="1"/>
+      <w:numFmt w:val="bullet"/>
+      <w:lvlText w:val="o"/>
+      <w:lvlJc w:val="left"/>
+      <w:pPr>
+        <w:ind w:left="1440" w:hanging="360"/>
+      </w:pPr>
+      <w:rPr>
+        <w:rFonts w:ascii="Courier New" w:hAnsi="Courier New" w:cs="Courier New" w:hint="default"/>
+      </w:rPr>
+    </w:lvl>
+    <w:lvl w:ilvl="2" w:tplc="04130005" w:tentative="1">
+      <w:start w:val="1"/>
+      <w:numFmt w:val="bullet"/>
+      <w:lvlText w:val=""/>
+      <w:lvlJc w:val="left"/>
+      <w:pPr>
+        <w:ind w:left="2160" w:hanging="360"/>
+      </w:pPr>
+      <w:rPr>
+        <w:rFonts w:ascii="Wingdings" w:hAnsi="Wingdings" w:hint="default"/>
+      </w:rPr>
+    </w:lvl>
+    <w:lvl w:ilvl="3" w:tplc="04130001" w:tentative="1">
+      <w:start w:val="1"/>
+      <w:numFmt w:val="bullet"/>
+      <w:lvlText w:val=""/>
+      <w:lvlJc w:val="left"/>
+      <w:pPr>
+        <w:ind w:left="2880" w:hanging="360"/>
+      </w:pPr>
+      <w:rPr>
+        <w:rFonts w:ascii="Symbol" w:hAnsi="Symbol" w:hint="default"/>
+      </w:rPr>
+    </w:lvl>
+    <w:lvl w:ilvl="4" w:tplc="04130003" w:tentative="1">
+      <w:start w:val="1"/>
+      <w:numFmt w:val="bullet"/>
+      <w:lvlText w:val="o"/>
+      <w:lvlJc w:val="left"/>
+      <w:pPr>
+        <w:ind w:left="3600" w:hanging="360"/>
+      </w:pPr>
+      <w:rPr>
+        <w:rFonts w:ascii="Courier New" w:hAnsi="Courier New" w:cs="Courier New" w:hint="default"/>
+      </w:rPr>
+    </w:lvl>
+    <w:lvl w:ilvl="5" w:tplc="04130005" w:tentative="1">
+      <w:start w:val="1"/>
+      <w:numFmt w:val="bullet"/>
+      <w:lvlText w:val=""/>
+      <w:lvlJc w:val="left"/>
+      <w:pPr>
+        <w:ind w:left="4320" w:hanging="360"/>
+      </w:pPr>
+      <w:rPr>
+        <w:rFonts w:ascii="Wingdings" w:hAnsi="Wingdings" w:hint="default"/>
+      </w:rPr>
+    </w:lvl>
+    <w:lvl w:ilvl="6" w:tplc="04130001" w:tentative="1">
+      <w:start w:val="1"/>
+      <w:numFmt w:val="bullet"/>
+      <w:lvlText w:val=""/>
+      <w:lvlJc w:val="left"/>
+      <w:pPr>
+        <w:ind w:left="5040" w:hanging="360"/>
+      </w:pPr>
+      <w:rPr>
+        <w:rFonts w:ascii="Symbol" w:hAnsi="Symbol" w:hint="default"/>
+      </w:rPr>
+    </w:lvl>
+    <w:lvl w:ilvl="7" w:tplc="04130003" w:tentative="1">
+      <w:start w:val="1"/>
+      <w:numFmt w:val="bullet"/>
+      <w:lvlText w:val="o"/>
+      <w:lvlJc w:val="left"/>
+      <w:pPr>
+        <w:ind w:left="5760" w:hanging="360"/>
+      </w:pPr>
+      <w:rPr>
+        <w:rFonts w:ascii="Courier New" w:hAnsi="Courier New" w:cs="Courier New" w:hint="default"/>
+      </w:rPr>
+    </w:lvl>
+    <w:lvl w:ilvl="8" w:tplc="04130005" w:tentative="1">
+      <w:start w:val="1"/>
+      <w:numFmt w:val="bullet"/>
+      <w:lvlText w:val=""/>
+      <w:lvlJc w:val="left"/>
+      <w:pPr>
+        <w:ind w:left="6480" w:hanging="360"/>
+      </w:pPr>
+      <w:rPr>
+        <w:rFonts w:ascii="Wingdings" w:hAnsi="Wingdings" w:hint="default"/>
+      </w:rPr>
+    </w:lvl>
+  </w:abstractNum>
+  <w:abstractNum w:abstractNumId="27" w15:restartNumberingAfterBreak="0">
     <w:nsid w:val="1B6A6D99"/>
     <w:multiLevelType w:val="hybridMultilevel"/>
     <w:tmpl w:val="9D1CA118"/>
@@ -5529,7 +6409,7 @@
       </w:rPr>
     </w:lvl>
   </w:abstractNum>
-  <w:abstractNum w:abstractNumId="27" w15:restartNumberingAfterBreak="0">
+  <w:abstractNum w:abstractNumId="28" w15:restartNumberingAfterBreak="0">
     <w:nsid w:val="1BF406E9"/>
     <w:multiLevelType w:val="hybridMultilevel"/>
     <w:tmpl w:val="741608F8"/>
@@ -5642,7 +6522,7 @@
       </w:rPr>
     </w:lvl>
   </w:abstractNum>
-  <w:abstractNum w:abstractNumId="28" w15:restartNumberingAfterBreak="0">
+  <w:abstractNum w:abstractNumId="29" w15:restartNumberingAfterBreak="0">
     <w:nsid w:val="1E6258B6"/>
     <w:multiLevelType w:val="hybridMultilevel"/>
     <w:tmpl w:val="EED4CAE0"/>
@@ -5755,7 +6635,7 @@
       </w:rPr>
     </w:lvl>
   </w:abstractNum>
-  <w:abstractNum w:abstractNumId="29" w15:restartNumberingAfterBreak="0">
+  <w:abstractNum w:abstractNumId="30" w15:restartNumberingAfterBreak="0">
     <w:nsid w:val="20A76887"/>
     <w:multiLevelType w:val="hybridMultilevel"/>
     <w:tmpl w:val="88E07C22"/>
@@ -5868,7 +6748,7 @@
       </w:rPr>
     </w:lvl>
   </w:abstractNum>
-  <w:abstractNum w:abstractNumId="30" w15:restartNumberingAfterBreak="0">
+  <w:abstractNum w:abstractNumId="31" w15:restartNumberingAfterBreak="0">
     <w:nsid w:val="21091AC9"/>
     <w:multiLevelType w:val="hybridMultilevel"/>
     <w:tmpl w:val="958218AE"/>
@@ -5981,7 +6861,7 @@
       </w:rPr>
     </w:lvl>
   </w:abstractNum>
-  <w:abstractNum w:abstractNumId="31" w15:restartNumberingAfterBreak="0">
+  <w:abstractNum w:abstractNumId="32" w15:restartNumberingAfterBreak="0">
     <w:nsid w:val="2141703D"/>
     <w:multiLevelType w:val="hybridMultilevel"/>
     <w:tmpl w:val="52329FD0"/>
@@ -6094,7 +6974,7 @@
       </w:rPr>
     </w:lvl>
   </w:abstractNum>
-  <w:abstractNum w:abstractNumId="32" w15:restartNumberingAfterBreak="0">
+  <w:abstractNum w:abstractNumId="33" w15:restartNumberingAfterBreak="0">
     <w:nsid w:val="22B94B04"/>
     <w:multiLevelType w:val="hybridMultilevel"/>
     <w:tmpl w:val="327AEC82"/>
@@ -6207,7 +7087,7 @@
       </w:rPr>
     </w:lvl>
   </w:abstractNum>
-  <w:abstractNum w:abstractNumId="33" w15:restartNumberingAfterBreak="0">
+  <w:abstractNum w:abstractNumId="34" w15:restartNumberingAfterBreak="0">
     <w:nsid w:val="237875E5"/>
     <w:multiLevelType w:val="hybridMultilevel"/>
     <w:tmpl w:val="586E0048"/>
@@ -6320,7 +7200,7 @@
       </w:rPr>
     </w:lvl>
   </w:abstractNum>
-  <w:abstractNum w:abstractNumId="34" w15:restartNumberingAfterBreak="0">
+  <w:abstractNum w:abstractNumId="35" w15:restartNumberingAfterBreak="0">
     <w:nsid w:val="259D2EAD"/>
     <w:multiLevelType w:val="hybridMultilevel"/>
     <w:tmpl w:val="AB56A89C"/>
@@ -6433,7 +7313,7 @@
       </w:rPr>
     </w:lvl>
   </w:abstractNum>
-  <w:abstractNum w:abstractNumId="35" w15:restartNumberingAfterBreak="0">
+  <w:abstractNum w:abstractNumId="36" w15:restartNumberingAfterBreak="0">
     <w:nsid w:val="267332D7"/>
     <w:multiLevelType w:val="hybridMultilevel"/>
     <w:tmpl w:val="3B861022"/>
@@ -6546,7 +7426,7 @@
       </w:rPr>
     </w:lvl>
   </w:abstractNum>
-  <w:abstractNum w:abstractNumId="36" w15:restartNumberingAfterBreak="0">
+  <w:abstractNum w:abstractNumId="37" w15:restartNumberingAfterBreak="0">
     <w:nsid w:val="26D74098"/>
     <w:multiLevelType w:val="multilevel"/>
     <w:tmpl w:val="DBDAE12C"/>
@@ -6692,7 +7572,7 @@
       </w:rPr>
     </w:lvl>
   </w:abstractNum>
-  <w:abstractNum w:abstractNumId="37" w15:restartNumberingAfterBreak="0">
+  <w:abstractNum w:abstractNumId="38" w15:restartNumberingAfterBreak="0">
     <w:nsid w:val="270E735C"/>
     <w:multiLevelType w:val="hybridMultilevel"/>
     <w:tmpl w:val="E13E8C2E"/>
@@ -6805,7 +7685,7 @@
       </w:rPr>
     </w:lvl>
   </w:abstractNum>
-  <w:abstractNum w:abstractNumId="38" w15:restartNumberingAfterBreak="0">
+  <w:abstractNum w:abstractNumId="39" w15:restartNumberingAfterBreak="0">
     <w:nsid w:val="283E143F"/>
     <w:multiLevelType w:val="multilevel"/>
     <w:tmpl w:val="D3BED9DE"/>
@@ -6954,7 +7834,7 @@
       </w:rPr>
     </w:lvl>
   </w:abstractNum>
-  <w:abstractNum w:abstractNumId="39" w15:restartNumberingAfterBreak="0">
+  <w:abstractNum w:abstractNumId="40" w15:restartNumberingAfterBreak="0">
     <w:nsid w:val="2BE1001B"/>
     <w:multiLevelType w:val="hybridMultilevel"/>
     <w:tmpl w:val="8542A1F8"/>
@@ -7067,7 +7947,7 @@
       </w:rPr>
     </w:lvl>
   </w:abstractNum>
-  <w:abstractNum w:abstractNumId="40" w15:restartNumberingAfterBreak="0">
+  <w:abstractNum w:abstractNumId="41" w15:restartNumberingAfterBreak="0">
     <w:nsid w:val="2CEC24F7"/>
     <w:multiLevelType w:val="hybridMultilevel"/>
     <w:tmpl w:val="B574C3D4"/>
@@ -7180,7 +8060,7 @@
       </w:rPr>
     </w:lvl>
   </w:abstractNum>
-  <w:abstractNum w:abstractNumId="41" w15:restartNumberingAfterBreak="0">
+  <w:abstractNum w:abstractNumId="42" w15:restartNumberingAfterBreak="0">
     <w:nsid w:val="2D862614"/>
     <w:multiLevelType w:val="hybridMultilevel"/>
     <w:tmpl w:val="14462C58"/>
@@ -7293,7 +8173,7 @@
       </w:rPr>
     </w:lvl>
   </w:abstractNum>
-  <w:abstractNum w:abstractNumId="42" w15:restartNumberingAfterBreak="0">
+  <w:abstractNum w:abstractNumId="43" w15:restartNumberingAfterBreak="0">
     <w:nsid w:val="2EEA1392"/>
     <w:multiLevelType w:val="hybridMultilevel"/>
     <w:tmpl w:val="084C95A4"/>
@@ -7406,7 +8286,7 @@
       </w:rPr>
     </w:lvl>
   </w:abstractNum>
-  <w:abstractNum w:abstractNumId="43" w15:restartNumberingAfterBreak="0">
+  <w:abstractNum w:abstractNumId="44" w15:restartNumberingAfterBreak="0">
     <w:nsid w:val="2FDD7647"/>
     <w:multiLevelType w:val="multilevel"/>
     <w:tmpl w:val="A46EBEE0"/>
@@ -7555,7 +8435,7 @@
       </w:rPr>
     </w:lvl>
   </w:abstractNum>
-  <w:abstractNum w:abstractNumId="44" w15:restartNumberingAfterBreak="0">
+  <w:abstractNum w:abstractNumId="45" w15:restartNumberingAfterBreak="0">
     <w:nsid w:val="301E368F"/>
     <w:multiLevelType w:val="hybridMultilevel"/>
     <w:tmpl w:val="713803D0"/>
@@ -7668,7 +8548,7 @@
       </w:rPr>
     </w:lvl>
   </w:abstractNum>
-  <w:abstractNum w:abstractNumId="45" w15:restartNumberingAfterBreak="0">
+  <w:abstractNum w:abstractNumId="46" w15:restartNumberingAfterBreak="0">
     <w:nsid w:val="30D768BB"/>
     <w:multiLevelType w:val="hybridMultilevel"/>
     <w:tmpl w:val="5CE29E0A"/>
@@ -7781,7 +8661,7 @@
       </w:rPr>
     </w:lvl>
   </w:abstractNum>
-  <w:abstractNum w:abstractNumId="46" w15:restartNumberingAfterBreak="0">
+  <w:abstractNum w:abstractNumId="47" w15:restartNumberingAfterBreak="0">
     <w:nsid w:val="30E75C01"/>
     <w:multiLevelType w:val="hybridMultilevel"/>
     <w:tmpl w:val="A572A0A8"/>
@@ -7894,7 +8774,7 @@
       </w:rPr>
     </w:lvl>
   </w:abstractNum>
-  <w:abstractNum w:abstractNumId="47" w15:restartNumberingAfterBreak="0">
+  <w:abstractNum w:abstractNumId="48" w15:restartNumberingAfterBreak="0">
     <w:nsid w:val="32866C8F"/>
     <w:multiLevelType w:val="hybridMultilevel"/>
     <w:tmpl w:val="FD820148"/>
@@ -8007,7 +8887,7 @@
       </w:rPr>
     </w:lvl>
   </w:abstractNum>
-  <w:abstractNum w:abstractNumId="48" w15:restartNumberingAfterBreak="0">
+  <w:abstractNum w:abstractNumId="49" w15:restartNumberingAfterBreak="0">
     <w:nsid w:val="33B2705A"/>
     <w:multiLevelType w:val="hybridMultilevel"/>
     <w:tmpl w:val="054CA778"/>
@@ -8120,7 +9000,7 @@
       </w:rPr>
     </w:lvl>
   </w:abstractNum>
-  <w:abstractNum w:abstractNumId="49" w15:restartNumberingAfterBreak="0">
+  <w:abstractNum w:abstractNumId="50" w15:restartNumberingAfterBreak="0">
     <w:nsid w:val="33E93831"/>
     <w:multiLevelType w:val="multilevel"/>
     <w:tmpl w:val="A164064A"/>
@@ -8269,7 +9149,7 @@
       </w:rPr>
     </w:lvl>
   </w:abstractNum>
-  <w:abstractNum w:abstractNumId="50" w15:restartNumberingAfterBreak="0">
+  <w:abstractNum w:abstractNumId="51" w15:restartNumberingAfterBreak="0">
     <w:nsid w:val="34277B55"/>
     <w:multiLevelType w:val="hybridMultilevel"/>
     <w:tmpl w:val="8D4E6F8A"/>
@@ -8382,7 +9262,7 @@
       </w:rPr>
     </w:lvl>
   </w:abstractNum>
-  <w:abstractNum w:abstractNumId="51" w15:restartNumberingAfterBreak="0">
+  <w:abstractNum w:abstractNumId="52" w15:restartNumberingAfterBreak="0">
     <w:nsid w:val="344D1ACD"/>
     <w:multiLevelType w:val="hybridMultilevel"/>
     <w:tmpl w:val="AABC85D8"/>
@@ -8495,7 +9375,7 @@
       </w:rPr>
     </w:lvl>
   </w:abstractNum>
-  <w:abstractNum w:abstractNumId="52" w15:restartNumberingAfterBreak="0">
+  <w:abstractNum w:abstractNumId="53" w15:restartNumberingAfterBreak="0">
     <w:nsid w:val="36FB00B4"/>
     <w:multiLevelType w:val="hybridMultilevel"/>
     <w:tmpl w:val="532E72EE"/>
@@ -8608,7 +9488,7 @@
       </w:rPr>
     </w:lvl>
   </w:abstractNum>
-  <w:abstractNum w:abstractNumId="53" w15:restartNumberingAfterBreak="0">
+  <w:abstractNum w:abstractNumId="54" w15:restartNumberingAfterBreak="0">
     <w:nsid w:val="386F4045"/>
     <w:multiLevelType w:val="hybridMultilevel"/>
     <w:tmpl w:val="D2B870C0"/>
@@ -8721,7 +9601,7 @@
       </w:rPr>
     </w:lvl>
   </w:abstractNum>
-  <w:abstractNum w:abstractNumId="54" w15:restartNumberingAfterBreak="0">
+  <w:abstractNum w:abstractNumId="55" w15:restartNumberingAfterBreak="0">
     <w:nsid w:val="387D5269"/>
     <w:multiLevelType w:val="hybridMultilevel"/>
     <w:tmpl w:val="8FA0863A"/>
@@ -8834,7 +9714,7 @@
       </w:rPr>
     </w:lvl>
   </w:abstractNum>
-  <w:abstractNum w:abstractNumId="55" w15:restartNumberingAfterBreak="0">
+  <w:abstractNum w:abstractNumId="56" w15:restartNumberingAfterBreak="0">
     <w:nsid w:val="38F13BE5"/>
     <w:multiLevelType w:val="hybridMultilevel"/>
     <w:tmpl w:val="1C6A6084"/>
@@ -8947,7 +9827,7 @@
       </w:rPr>
     </w:lvl>
   </w:abstractNum>
-  <w:abstractNum w:abstractNumId="56" w15:restartNumberingAfterBreak="0">
+  <w:abstractNum w:abstractNumId="57" w15:restartNumberingAfterBreak="0">
     <w:nsid w:val="3954096B"/>
     <w:multiLevelType w:val="hybridMultilevel"/>
     <w:tmpl w:val="1F30E758"/>
@@ -9060,7 +9940,7 @@
       </w:rPr>
     </w:lvl>
   </w:abstractNum>
-  <w:abstractNum w:abstractNumId="57" w15:restartNumberingAfterBreak="0">
+  <w:abstractNum w:abstractNumId="58" w15:restartNumberingAfterBreak="0">
     <w:nsid w:val="3ADB1AB7"/>
     <w:multiLevelType w:val="hybridMultilevel"/>
     <w:tmpl w:val="235E28D4"/>
@@ -9173,7 +10053,120 @@
       </w:rPr>
     </w:lvl>
   </w:abstractNum>
-  <w:abstractNum w:abstractNumId="58" w15:restartNumberingAfterBreak="0">
+  <w:abstractNum w:abstractNumId="59" w15:restartNumberingAfterBreak="0">
+    <w:nsid w:val="3AE40485"/>
+    <w:multiLevelType w:val="hybridMultilevel"/>
+    <w:tmpl w:val="48B25276"/>
+    <w:lvl w:ilvl="0" w:tplc="04130001">
+      <w:start w:val="1"/>
+      <w:numFmt w:val="bullet"/>
+      <w:lvlText w:val=""/>
+      <w:lvlJc w:val="left"/>
+      <w:pPr>
+        <w:ind w:left="720" w:hanging="360"/>
+      </w:pPr>
+      <w:rPr>
+        <w:rFonts w:ascii="Symbol" w:hAnsi="Symbol" w:hint="default"/>
+      </w:rPr>
+    </w:lvl>
+    <w:lvl w:ilvl="1" w:tplc="04130003" w:tentative="1">
+      <w:start w:val="1"/>
+      <w:numFmt w:val="bullet"/>
+      <w:lvlText w:val="o"/>
+      <w:lvlJc w:val="left"/>
+      <w:pPr>
+        <w:ind w:left="1440" w:hanging="360"/>
+      </w:pPr>
+      <w:rPr>
+        <w:rFonts w:ascii="Courier New" w:hAnsi="Courier New" w:cs="Courier New" w:hint="default"/>
+      </w:rPr>
+    </w:lvl>
+    <w:lvl w:ilvl="2" w:tplc="04130005" w:tentative="1">
+      <w:start w:val="1"/>
+      <w:numFmt w:val="bullet"/>
+      <w:lvlText w:val=""/>
+      <w:lvlJc w:val="left"/>
+      <w:pPr>
+        <w:ind w:left="2160" w:hanging="360"/>
+      </w:pPr>
+      <w:rPr>
+        <w:rFonts w:ascii="Wingdings" w:hAnsi="Wingdings" w:hint="default"/>
+      </w:rPr>
+    </w:lvl>
+    <w:lvl w:ilvl="3" w:tplc="04130001" w:tentative="1">
+      <w:start w:val="1"/>
+      <w:numFmt w:val="bullet"/>
+      <w:lvlText w:val=""/>
+      <w:lvlJc w:val="left"/>
+      <w:pPr>
+        <w:ind w:left="2880" w:hanging="360"/>
+      </w:pPr>
+      <w:rPr>
+        <w:rFonts w:ascii="Symbol" w:hAnsi="Symbol" w:hint="default"/>
+      </w:rPr>
+    </w:lvl>
+    <w:lvl w:ilvl="4" w:tplc="04130003" w:tentative="1">
+      <w:start w:val="1"/>
+      <w:numFmt w:val="bullet"/>
+      <w:lvlText w:val="o"/>
+      <w:lvlJc w:val="left"/>
+      <w:pPr>
+        <w:ind w:left="3600" w:hanging="360"/>
+      </w:pPr>
+      <w:rPr>
+        <w:rFonts w:ascii="Courier New" w:hAnsi="Courier New" w:cs="Courier New" w:hint="default"/>
+      </w:rPr>
+    </w:lvl>
+    <w:lvl w:ilvl="5" w:tplc="04130005" w:tentative="1">
+      <w:start w:val="1"/>
+      <w:numFmt w:val="bullet"/>
+      <w:lvlText w:val=""/>
+      <w:lvlJc w:val="left"/>
+      <w:pPr>
+        <w:ind w:left="4320" w:hanging="360"/>
+      </w:pPr>
+      <w:rPr>
+        <w:rFonts w:ascii="Wingdings" w:hAnsi="Wingdings" w:hint="default"/>
+      </w:rPr>
+    </w:lvl>
+    <w:lvl w:ilvl="6" w:tplc="04130001" w:tentative="1">
+      <w:start w:val="1"/>
+      <w:numFmt w:val="bullet"/>
+      <w:lvlText w:val=""/>
+      <w:lvlJc w:val="left"/>
+      <w:pPr>
+        <w:ind w:left="5040" w:hanging="360"/>
+      </w:pPr>
+      <w:rPr>
+        <w:rFonts w:ascii="Symbol" w:hAnsi="Symbol" w:hint="default"/>
+      </w:rPr>
+    </w:lvl>
+    <w:lvl w:ilvl="7" w:tplc="04130003" w:tentative="1">
+      <w:start w:val="1"/>
+      <w:numFmt w:val="bullet"/>
+      <w:lvlText w:val="o"/>
+      <w:lvlJc w:val="left"/>
+      <w:pPr>
+        <w:ind w:left="5760" w:hanging="360"/>
+      </w:pPr>
+      <w:rPr>
+        <w:rFonts w:ascii="Courier New" w:hAnsi="Courier New" w:cs="Courier New" w:hint="default"/>
+      </w:rPr>
+    </w:lvl>
+    <w:lvl w:ilvl="8" w:tplc="04130005" w:tentative="1">
+      <w:start w:val="1"/>
+      <w:numFmt w:val="bullet"/>
+      <w:lvlText w:val=""/>
+      <w:lvlJc w:val="left"/>
+      <w:pPr>
+        <w:ind w:left="6480" w:hanging="360"/>
+      </w:pPr>
+      <w:rPr>
+        <w:rFonts w:ascii="Wingdings" w:hAnsi="Wingdings" w:hint="default"/>
+      </w:rPr>
+    </w:lvl>
+  </w:abstractNum>
+  <w:abstractNum w:abstractNumId="60" w15:restartNumberingAfterBreak="0">
     <w:nsid w:val="3AE46DEA"/>
     <w:multiLevelType w:val="multilevel"/>
     <w:tmpl w:val="D174FBA4"/>
@@ -9322,7 +10315,7 @@
       </w:rPr>
     </w:lvl>
   </w:abstractNum>
-  <w:abstractNum w:abstractNumId="59" w15:restartNumberingAfterBreak="0">
+  <w:abstractNum w:abstractNumId="61" w15:restartNumberingAfterBreak="0">
     <w:nsid w:val="3C0E3512"/>
     <w:multiLevelType w:val="hybridMultilevel"/>
     <w:tmpl w:val="407666AE"/>
@@ -9435,7 +10428,7 @@
       </w:rPr>
     </w:lvl>
   </w:abstractNum>
-  <w:abstractNum w:abstractNumId="60" w15:restartNumberingAfterBreak="0">
+  <w:abstractNum w:abstractNumId="62" w15:restartNumberingAfterBreak="0">
     <w:nsid w:val="3D327972"/>
     <w:multiLevelType w:val="hybridMultilevel"/>
     <w:tmpl w:val="B218E79E"/>
@@ -9548,7 +10541,7 @@
       </w:rPr>
     </w:lvl>
   </w:abstractNum>
-  <w:abstractNum w:abstractNumId="61" w15:restartNumberingAfterBreak="0">
+  <w:abstractNum w:abstractNumId="63" w15:restartNumberingAfterBreak="0">
     <w:nsid w:val="3D6B0412"/>
     <w:multiLevelType w:val="multilevel"/>
     <w:tmpl w:val="CCE02E84"/>
@@ -9697,7 +10690,7 @@
       </w:rPr>
     </w:lvl>
   </w:abstractNum>
-  <w:abstractNum w:abstractNumId="62" w15:restartNumberingAfterBreak="0">
+  <w:abstractNum w:abstractNumId="64" w15:restartNumberingAfterBreak="0">
     <w:nsid w:val="3E97688A"/>
     <w:multiLevelType w:val="hybridMultilevel"/>
     <w:tmpl w:val="6236279E"/>
@@ -9810,7 +10803,7 @@
       </w:rPr>
     </w:lvl>
   </w:abstractNum>
-  <w:abstractNum w:abstractNumId="63" w15:restartNumberingAfterBreak="0">
+  <w:abstractNum w:abstractNumId="65" w15:restartNumberingAfterBreak="0">
     <w:nsid w:val="3EC667E9"/>
     <w:multiLevelType w:val="multilevel"/>
     <w:tmpl w:val="6004F2E0"/>
@@ -9923,7 +10916,7 @@
       </w:pPr>
     </w:lvl>
   </w:abstractNum>
-  <w:abstractNum w:abstractNumId="64" w15:restartNumberingAfterBreak="0">
+  <w:abstractNum w:abstractNumId="66" w15:restartNumberingAfterBreak="0">
     <w:nsid w:val="40391302"/>
     <w:multiLevelType w:val="hybridMultilevel"/>
     <w:tmpl w:val="F3C21EF2"/>
@@ -10036,7 +11029,7 @@
       </w:rPr>
     </w:lvl>
   </w:abstractNum>
-  <w:abstractNum w:abstractNumId="65" w15:restartNumberingAfterBreak="0">
+  <w:abstractNum w:abstractNumId="67" w15:restartNumberingAfterBreak="0">
     <w:nsid w:val="40B479D8"/>
     <w:multiLevelType w:val="hybridMultilevel"/>
     <w:tmpl w:val="2EF24270"/>
@@ -10149,7 +11142,7 @@
       </w:rPr>
     </w:lvl>
   </w:abstractNum>
-  <w:abstractNum w:abstractNumId="66" w15:restartNumberingAfterBreak="0">
+  <w:abstractNum w:abstractNumId="68" w15:restartNumberingAfterBreak="0">
     <w:nsid w:val="420033C4"/>
     <w:multiLevelType w:val="multilevel"/>
     <w:tmpl w:val="292E125C"/>
@@ -10298,7 +11291,7 @@
       </w:rPr>
     </w:lvl>
   </w:abstractNum>
-  <w:abstractNum w:abstractNumId="67" w15:restartNumberingAfterBreak="0">
+  <w:abstractNum w:abstractNumId="69" w15:restartNumberingAfterBreak="0">
     <w:nsid w:val="433A4B0C"/>
     <w:multiLevelType w:val="hybridMultilevel"/>
     <w:tmpl w:val="83C6E0DC"/>
@@ -10411,7 +11404,7 @@
       </w:rPr>
     </w:lvl>
   </w:abstractNum>
-  <w:abstractNum w:abstractNumId="68" w15:restartNumberingAfterBreak="0">
+  <w:abstractNum w:abstractNumId="70" w15:restartNumberingAfterBreak="0">
     <w:nsid w:val="45185D12"/>
     <w:multiLevelType w:val="hybridMultilevel"/>
     <w:tmpl w:val="92681C5E"/>
@@ -10524,7 +11517,7 @@
       </w:rPr>
     </w:lvl>
   </w:abstractNum>
-  <w:abstractNum w:abstractNumId="69" w15:restartNumberingAfterBreak="0">
+  <w:abstractNum w:abstractNumId="71" w15:restartNumberingAfterBreak="0">
     <w:nsid w:val="451D3819"/>
     <w:multiLevelType w:val="hybridMultilevel"/>
     <w:tmpl w:val="9028E860"/>
@@ -10637,7 +11630,7 @@
       </w:rPr>
     </w:lvl>
   </w:abstractNum>
-  <w:abstractNum w:abstractNumId="70" w15:restartNumberingAfterBreak="0">
+  <w:abstractNum w:abstractNumId="72" w15:restartNumberingAfterBreak="0">
     <w:nsid w:val="45B2061E"/>
     <w:multiLevelType w:val="hybridMultilevel"/>
     <w:tmpl w:val="94224DD4"/>
@@ -10750,7 +11743,7 @@
       </w:rPr>
     </w:lvl>
   </w:abstractNum>
-  <w:abstractNum w:abstractNumId="71" w15:restartNumberingAfterBreak="0">
+  <w:abstractNum w:abstractNumId="73" w15:restartNumberingAfterBreak="0">
     <w:nsid w:val="45EC20CF"/>
     <w:multiLevelType w:val="multilevel"/>
     <w:tmpl w:val="C4F2FF12"/>
@@ -10899,7 +11892,7 @@
       </w:rPr>
     </w:lvl>
   </w:abstractNum>
-  <w:abstractNum w:abstractNumId="72" w15:restartNumberingAfterBreak="0">
+  <w:abstractNum w:abstractNumId="74" w15:restartNumberingAfterBreak="0">
     <w:nsid w:val="45EE6F43"/>
     <w:multiLevelType w:val="hybridMultilevel"/>
     <w:tmpl w:val="7492873A"/>
@@ -11012,7 +12005,7 @@
       </w:rPr>
     </w:lvl>
   </w:abstractNum>
-  <w:abstractNum w:abstractNumId="73" w15:restartNumberingAfterBreak="0">
+  <w:abstractNum w:abstractNumId="75" w15:restartNumberingAfterBreak="0">
     <w:nsid w:val="46F86991"/>
     <w:multiLevelType w:val="hybridMultilevel"/>
     <w:tmpl w:val="532C469E"/>
@@ -11125,7 +12118,7 @@
       </w:rPr>
     </w:lvl>
   </w:abstractNum>
-  <w:abstractNum w:abstractNumId="74" w15:restartNumberingAfterBreak="0">
+  <w:abstractNum w:abstractNumId="76" w15:restartNumberingAfterBreak="0">
     <w:nsid w:val="483307FA"/>
     <w:multiLevelType w:val="hybridMultilevel"/>
     <w:tmpl w:val="4DCC0E6E"/>
@@ -11238,7 +12231,7 @@
       </w:rPr>
     </w:lvl>
   </w:abstractNum>
-  <w:abstractNum w:abstractNumId="75" w15:restartNumberingAfterBreak="0">
+  <w:abstractNum w:abstractNumId="77" w15:restartNumberingAfterBreak="0">
     <w:nsid w:val="488B3DFD"/>
     <w:multiLevelType w:val="multilevel"/>
     <w:tmpl w:val="9086E08E"/>
@@ -11387,7 +12380,7 @@
       </w:rPr>
     </w:lvl>
   </w:abstractNum>
-  <w:abstractNum w:abstractNumId="76" w15:restartNumberingAfterBreak="0">
+  <w:abstractNum w:abstractNumId="78" w15:restartNumberingAfterBreak="0">
     <w:nsid w:val="48BF117A"/>
     <w:multiLevelType w:val="multilevel"/>
     <w:tmpl w:val="C3BE07D2"/>
@@ -11503,7 +12496,7 @@
       </w:pPr>
     </w:lvl>
   </w:abstractNum>
-  <w:abstractNum w:abstractNumId="77" w15:restartNumberingAfterBreak="0">
+  <w:abstractNum w:abstractNumId="79" w15:restartNumberingAfterBreak="0">
     <w:nsid w:val="4A0C7411"/>
     <w:multiLevelType w:val="hybridMultilevel"/>
     <w:tmpl w:val="C522629C"/>
@@ -11616,7 +12609,7 @@
       </w:rPr>
     </w:lvl>
   </w:abstractNum>
-  <w:abstractNum w:abstractNumId="78" w15:restartNumberingAfterBreak="0">
+  <w:abstractNum w:abstractNumId="80" w15:restartNumberingAfterBreak="0">
     <w:nsid w:val="4A1A0C6A"/>
     <w:multiLevelType w:val="hybridMultilevel"/>
     <w:tmpl w:val="FAF094D8"/>
@@ -11729,7 +12722,7 @@
       </w:rPr>
     </w:lvl>
   </w:abstractNum>
-  <w:abstractNum w:abstractNumId="79" w15:restartNumberingAfterBreak="0">
+  <w:abstractNum w:abstractNumId="81" w15:restartNumberingAfterBreak="0">
     <w:nsid w:val="4A66642F"/>
     <w:multiLevelType w:val="hybridMultilevel"/>
     <w:tmpl w:val="7354CA7A"/>
@@ -11842,7 +12835,7 @@
       </w:rPr>
     </w:lvl>
   </w:abstractNum>
-  <w:abstractNum w:abstractNumId="80" w15:restartNumberingAfterBreak="0">
+  <w:abstractNum w:abstractNumId="82" w15:restartNumberingAfterBreak="0">
     <w:nsid w:val="4B960AF7"/>
     <w:multiLevelType w:val="hybridMultilevel"/>
     <w:tmpl w:val="8B0CC156"/>
@@ -11955,7 +12948,7 @@
       </w:rPr>
     </w:lvl>
   </w:abstractNum>
-  <w:abstractNum w:abstractNumId="81" w15:restartNumberingAfterBreak="0">
+  <w:abstractNum w:abstractNumId="83" w15:restartNumberingAfterBreak="0">
     <w:nsid w:val="4D115C63"/>
     <w:multiLevelType w:val="hybridMultilevel"/>
     <w:tmpl w:val="F8C2DC4C"/>
@@ -12068,7 +13061,7 @@
       </w:rPr>
     </w:lvl>
   </w:abstractNum>
-  <w:abstractNum w:abstractNumId="82" w15:restartNumberingAfterBreak="0">
+  <w:abstractNum w:abstractNumId="84" w15:restartNumberingAfterBreak="0">
     <w:nsid w:val="4D310700"/>
     <w:multiLevelType w:val="hybridMultilevel"/>
     <w:tmpl w:val="803885B0"/>
@@ -12181,7 +13174,7 @@
       </w:rPr>
     </w:lvl>
   </w:abstractNum>
-  <w:abstractNum w:abstractNumId="83" w15:restartNumberingAfterBreak="0">
+  <w:abstractNum w:abstractNumId="85" w15:restartNumberingAfterBreak="0">
     <w:nsid w:val="4DA86B37"/>
     <w:multiLevelType w:val="hybridMultilevel"/>
     <w:tmpl w:val="B89E2688"/>
@@ -12294,7 +13287,7 @@
       </w:rPr>
     </w:lvl>
   </w:abstractNum>
-  <w:abstractNum w:abstractNumId="84" w15:restartNumberingAfterBreak="0">
+  <w:abstractNum w:abstractNumId="86" w15:restartNumberingAfterBreak="0">
     <w:nsid w:val="4E2E0791"/>
     <w:multiLevelType w:val="hybridMultilevel"/>
     <w:tmpl w:val="D6D4148A"/>
@@ -12407,7 +13400,7 @@
       </w:rPr>
     </w:lvl>
   </w:abstractNum>
-  <w:abstractNum w:abstractNumId="85" w15:restartNumberingAfterBreak="0">
+  <w:abstractNum w:abstractNumId="87" w15:restartNumberingAfterBreak="0">
     <w:nsid w:val="4EAF538A"/>
     <w:multiLevelType w:val="multilevel"/>
     <w:tmpl w:val="E140179E"/>
@@ -12551,7 +13544,7 @@
       </w:rPr>
     </w:lvl>
   </w:abstractNum>
-  <w:abstractNum w:abstractNumId="86" w15:restartNumberingAfterBreak="0">
+  <w:abstractNum w:abstractNumId="88" w15:restartNumberingAfterBreak="0">
     <w:nsid w:val="4F18231D"/>
     <w:multiLevelType w:val="multilevel"/>
     <w:tmpl w:val="C3BE07D2"/>
@@ -12667,7 +13660,7 @@
       </w:pPr>
     </w:lvl>
   </w:abstractNum>
-  <w:abstractNum w:abstractNumId="87" w15:restartNumberingAfterBreak="0">
+  <w:abstractNum w:abstractNumId="89" w15:restartNumberingAfterBreak="0">
     <w:nsid w:val="4F2E4C16"/>
     <w:multiLevelType w:val="multilevel"/>
     <w:tmpl w:val="5F6E5988"/>
@@ -12816,7 +13809,7 @@
       </w:rPr>
     </w:lvl>
   </w:abstractNum>
-  <w:abstractNum w:abstractNumId="88" w15:restartNumberingAfterBreak="0">
+  <w:abstractNum w:abstractNumId="90" w15:restartNumberingAfterBreak="0">
     <w:nsid w:val="502D1613"/>
     <w:multiLevelType w:val="multilevel"/>
     <w:tmpl w:val="076035BC"/>
@@ -12965,7 +13958,7 @@
       </w:rPr>
     </w:lvl>
   </w:abstractNum>
-  <w:abstractNum w:abstractNumId="89" w15:restartNumberingAfterBreak="0">
+  <w:abstractNum w:abstractNumId="91" w15:restartNumberingAfterBreak="0">
     <w:nsid w:val="51091258"/>
     <w:multiLevelType w:val="hybridMultilevel"/>
     <w:tmpl w:val="DB888708"/>
@@ -13078,7 +14071,7 @@
       </w:rPr>
     </w:lvl>
   </w:abstractNum>
-  <w:abstractNum w:abstractNumId="90" w15:restartNumberingAfterBreak="0">
+  <w:abstractNum w:abstractNumId="92" w15:restartNumberingAfterBreak="0">
     <w:nsid w:val="51295117"/>
     <w:multiLevelType w:val="multilevel"/>
     <w:tmpl w:val="3DCE87AC"/>
@@ -13191,7 +14184,7 @@
       </w:pPr>
     </w:lvl>
   </w:abstractNum>
-  <w:abstractNum w:abstractNumId="91" w15:restartNumberingAfterBreak="0">
+  <w:abstractNum w:abstractNumId="93" w15:restartNumberingAfterBreak="0">
     <w:nsid w:val="517F38CE"/>
     <w:multiLevelType w:val="multilevel"/>
     <w:tmpl w:val="F05EF82C"/>
@@ -13340,7 +14333,7 @@
       </w:rPr>
     </w:lvl>
   </w:abstractNum>
-  <w:abstractNum w:abstractNumId="92" w15:restartNumberingAfterBreak="0">
+  <w:abstractNum w:abstractNumId="94" w15:restartNumberingAfterBreak="0">
     <w:nsid w:val="518D529D"/>
     <w:multiLevelType w:val="hybridMultilevel"/>
     <w:tmpl w:val="3586C97C"/>
@@ -13453,7 +14446,7 @@
       </w:rPr>
     </w:lvl>
   </w:abstractNum>
-  <w:abstractNum w:abstractNumId="93" w15:restartNumberingAfterBreak="0">
+  <w:abstractNum w:abstractNumId="95" w15:restartNumberingAfterBreak="0">
     <w:nsid w:val="51A44D3F"/>
     <w:multiLevelType w:val="multilevel"/>
     <w:tmpl w:val="508A4ED0"/>
@@ -13602,7 +14595,7 @@
       </w:rPr>
     </w:lvl>
   </w:abstractNum>
-  <w:abstractNum w:abstractNumId="94" w15:restartNumberingAfterBreak="0">
+  <w:abstractNum w:abstractNumId="96" w15:restartNumberingAfterBreak="0">
     <w:nsid w:val="51EB6CEA"/>
     <w:multiLevelType w:val="multilevel"/>
     <w:tmpl w:val="14847C2E"/>
@@ -13751,7 +14744,7 @@
       </w:rPr>
     </w:lvl>
   </w:abstractNum>
-  <w:abstractNum w:abstractNumId="95" w15:restartNumberingAfterBreak="0">
+  <w:abstractNum w:abstractNumId="97" w15:restartNumberingAfterBreak="0">
     <w:nsid w:val="521C54C6"/>
     <w:multiLevelType w:val="hybridMultilevel"/>
     <w:tmpl w:val="D33C4C26"/>
@@ -13864,7 +14857,7 @@
       </w:rPr>
     </w:lvl>
   </w:abstractNum>
-  <w:abstractNum w:abstractNumId="96" w15:restartNumberingAfterBreak="0">
+  <w:abstractNum w:abstractNumId="98" w15:restartNumberingAfterBreak="0">
     <w:nsid w:val="526A7112"/>
     <w:multiLevelType w:val="hybridMultilevel"/>
     <w:tmpl w:val="FC107D88"/>
@@ -13977,7 +14970,7 @@
       </w:rPr>
     </w:lvl>
   </w:abstractNum>
-  <w:abstractNum w:abstractNumId="97" w15:restartNumberingAfterBreak="0">
+  <w:abstractNum w:abstractNumId="99" w15:restartNumberingAfterBreak="0">
     <w:nsid w:val="537751F9"/>
     <w:multiLevelType w:val="hybridMultilevel"/>
     <w:tmpl w:val="0B9CE21E"/>
@@ -14090,7 +15083,7 @@
       </w:rPr>
     </w:lvl>
   </w:abstractNum>
-  <w:abstractNum w:abstractNumId="98" w15:restartNumberingAfterBreak="0">
+  <w:abstractNum w:abstractNumId="100" w15:restartNumberingAfterBreak="0">
     <w:nsid w:val="55112941"/>
     <w:multiLevelType w:val="hybridMultilevel"/>
     <w:tmpl w:val="B1FE0D90"/>
@@ -14203,7 +15196,7 @@
       </w:rPr>
     </w:lvl>
   </w:abstractNum>
-  <w:abstractNum w:abstractNumId="99" w15:restartNumberingAfterBreak="0">
+  <w:abstractNum w:abstractNumId="101" w15:restartNumberingAfterBreak="0">
     <w:nsid w:val="56276918"/>
     <w:multiLevelType w:val="hybridMultilevel"/>
     <w:tmpl w:val="853E163E"/>
@@ -14316,7 +15309,7 @@
       </w:rPr>
     </w:lvl>
   </w:abstractNum>
-  <w:abstractNum w:abstractNumId="100" w15:restartNumberingAfterBreak="0">
+  <w:abstractNum w:abstractNumId="102" w15:restartNumberingAfterBreak="0">
     <w:nsid w:val="59B8301E"/>
     <w:multiLevelType w:val="hybridMultilevel"/>
     <w:tmpl w:val="1DCC6AA2"/>
@@ -14429,7 +15422,7 @@
       </w:rPr>
     </w:lvl>
   </w:abstractNum>
-  <w:abstractNum w:abstractNumId="101" w15:restartNumberingAfterBreak="0">
+  <w:abstractNum w:abstractNumId="103" w15:restartNumberingAfterBreak="0">
     <w:nsid w:val="5A0E1DC0"/>
     <w:multiLevelType w:val="hybridMultilevel"/>
     <w:tmpl w:val="F1D4FFFA"/>
@@ -14542,7 +15535,7 @@
       </w:rPr>
     </w:lvl>
   </w:abstractNum>
-  <w:abstractNum w:abstractNumId="102" w15:restartNumberingAfterBreak="0">
+  <w:abstractNum w:abstractNumId="104" w15:restartNumberingAfterBreak="0">
     <w:nsid w:val="5AA81ABA"/>
     <w:multiLevelType w:val="multilevel"/>
     <w:tmpl w:val="053E89A2"/>
@@ -14691,7 +15684,7 @@
       </w:rPr>
     </w:lvl>
   </w:abstractNum>
-  <w:abstractNum w:abstractNumId="103" w15:restartNumberingAfterBreak="0">
+  <w:abstractNum w:abstractNumId="105" w15:restartNumberingAfterBreak="0">
     <w:nsid w:val="5AB65072"/>
     <w:multiLevelType w:val="hybridMultilevel"/>
     <w:tmpl w:val="DE74A388"/>
@@ -14804,7 +15797,7 @@
       </w:rPr>
     </w:lvl>
   </w:abstractNum>
-  <w:abstractNum w:abstractNumId="104" w15:restartNumberingAfterBreak="0">
+  <w:abstractNum w:abstractNumId="106" w15:restartNumberingAfterBreak="0">
     <w:nsid w:val="5AFF3CE7"/>
     <w:multiLevelType w:val="hybridMultilevel"/>
     <w:tmpl w:val="6078390A"/>
@@ -14917,7 +15910,7 @@
       </w:rPr>
     </w:lvl>
   </w:abstractNum>
-  <w:abstractNum w:abstractNumId="105" w15:restartNumberingAfterBreak="0">
+  <w:abstractNum w:abstractNumId="107" w15:restartNumberingAfterBreak="0">
     <w:nsid w:val="5B940EAB"/>
     <w:multiLevelType w:val="hybridMultilevel"/>
     <w:tmpl w:val="AC5245B4"/>
@@ -15030,7 +16023,7 @@
       </w:rPr>
     </w:lvl>
   </w:abstractNum>
-  <w:abstractNum w:abstractNumId="106" w15:restartNumberingAfterBreak="0">
+  <w:abstractNum w:abstractNumId="108" w15:restartNumberingAfterBreak="0">
     <w:nsid w:val="5BA811DA"/>
     <w:multiLevelType w:val="hybridMultilevel"/>
     <w:tmpl w:val="F384B5D8"/>
@@ -15143,7 +16136,7 @@
       </w:rPr>
     </w:lvl>
   </w:abstractNum>
-  <w:abstractNum w:abstractNumId="107" w15:restartNumberingAfterBreak="0">
+  <w:abstractNum w:abstractNumId="109" w15:restartNumberingAfterBreak="0">
     <w:nsid w:val="5BD72382"/>
     <w:multiLevelType w:val="hybridMultilevel"/>
     <w:tmpl w:val="BDE80976"/>
@@ -15256,7 +16249,7 @@
       </w:rPr>
     </w:lvl>
   </w:abstractNum>
-  <w:abstractNum w:abstractNumId="108" w15:restartNumberingAfterBreak="0">
+  <w:abstractNum w:abstractNumId="110" w15:restartNumberingAfterBreak="0">
     <w:nsid w:val="5BE05FC5"/>
     <w:multiLevelType w:val="multilevel"/>
     <w:tmpl w:val="AEDEF392"/>
@@ -15405,7 +16398,7 @@
       </w:rPr>
     </w:lvl>
   </w:abstractNum>
-  <w:abstractNum w:abstractNumId="109" w15:restartNumberingAfterBreak="0">
+  <w:abstractNum w:abstractNumId="111" w15:restartNumberingAfterBreak="0">
     <w:nsid w:val="5C016449"/>
     <w:multiLevelType w:val="hybridMultilevel"/>
     <w:tmpl w:val="8D1609F6"/>
@@ -15518,7 +16511,7 @@
       </w:rPr>
     </w:lvl>
   </w:abstractNum>
-  <w:abstractNum w:abstractNumId="110" w15:restartNumberingAfterBreak="0">
+  <w:abstractNum w:abstractNumId="112" w15:restartNumberingAfterBreak="0">
     <w:nsid w:val="5C8243F3"/>
     <w:multiLevelType w:val="hybridMultilevel"/>
     <w:tmpl w:val="14ECE966"/>
@@ -15631,7 +16624,7 @@
       </w:rPr>
     </w:lvl>
   </w:abstractNum>
-  <w:abstractNum w:abstractNumId="111" w15:restartNumberingAfterBreak="0">
+  <w:abstractNum w:abstractNumId="113" w15:restartNumberingAfterBreak="0">
     <w:nsid w:val="5D1E1134"/>
     <w:multiLevelType w:val="hybridMultilevel"/>
     <w:tmpl w:val="450C456C"/>
@@ -15744,7 +16737,7 @@
       </w:rPr>
     </w:lvl>
   </w:abstractNum>
-  <w:abstractNum w:abstractNumId="112" w15:restartNumberingAfterBreak="0">
+  <w:abstractNum w:abstractNumId="114" w15:restartNumberingAfterBreak="0">
     <w:nsid w:val="5D1E1978"/>
     <w:multiLevelType w:val="hybridMultilevel"/>
     <w:tmpl w:val="8C7E6310"/>
@@ -15857,7 +16850,7 @@
       </w:rPr>
     </w:lvl>
   </w:abstractNum>
-  <w:abstractNum w:abstractNumId="113" w15:restartNumberingAfterBreak="0">
+  <w:abstractNum w:abstractNumId="115" w15:restartNumberingAfterBreak="0">
     <w:nsid w:val="5D6D6F29"/>
     <w:multiLevelType w:val="multilevel"/>
     <w:tmpl w:val="76842046"/>
@@ -16006,7 +16999,7 @@
       </w:rPr>
     </w:lvl>
   </w:abstractNum>
-  <w:abstractNum w:abstractNumId="114" w15:restartNumberingAfterBreak="0">
+  <w:abstractNum w:abstractNumId="116" w15:restartNumberingAfterBreak="0">
     <w:nsid w:val="5D9310FC"/>
     <w:multiLevelType w:val="multilevel"/>
     <w:tmpl w:val="B136D50A"/>
@@ -16155,7 +17148,7 @@
       </w:rPr>
     </w:lvl>
   </w:abstractNum>
-  <w:abstractNum w:abstractNumId="115" w15:restartNumberingAfterBreak="0">
+  <w:abstractNum w:abstractNumId="117" w15:restartNumberingAfterBreak="0">
     <w:nsid w:val="62A770FC"/>
     <w:multiLevelType w:val="hybridMultilevel"/>
     <w:tmpl w:val="6AE0883E"/>
@@ -16268,7 +17261,7 @@
       </w:rPr>
     </w:lvl>
   </w:abstractNum>
-  <w:abstractNum w:abstractNumId="116" w15:restartNumberingAfterBreak="0">
+  <w:abstractNum w:abstractNumId="118" w15:restartNumberingAfterBreak="0">
     <w:nsid w:val="62CE57D8"/>
     <w:multiLevelType w:val="hybridMultilevel"/>
     <w:tmpl w:val="7C229BE4"/>
@@ -16381,7 +17374,7 @@
       </w:rPr>
     </w:lvl>
   </w:abstractNum>
-  <w:abstractNum w:abstractNumId="117" w15:restartNumberingAfterBreak="0">
+  <w:abstractNum w:abstractNumId="119" w15:restartNumberingAfterBreak="0">
     <w:nsid w:val="65164BFA"/>
     <w:multiLevelType w:val="hybridMultilevel"/>
     <w:tmpl w:val="14624A66"/>
@@ -16494,7 +17487,7 @@
       </w:rPr>
     </w:lvl>
   </w:abstractNum>
-  <w:abstractNum w:abstractNumId="118" w15:restartNumberingAfterBreak="0">
+  <w:abstractNum w:abstractNumId="120" w15:restartNumberingAfterBreak="0">
     <w:nsid w:val="66464C39"/>
     <w:multiLevelType w:val="hybridMultilevel"/>
     <w:tmpl w:val="D2F6BE0A"/>
@@ -16607,7 +17600,7 @@
       </w:rPr>
     </w:lvl>
   </w:abstractNum>
-  <w:abstractNum w:abstractNumId="119" w15:restartNumberingAfterBreak="0">
+  <w:abstractNum w:abstractNumId="121" w15:restartNumberingAfterBreak="0">
     <w:nsid w:val="668D77AA"/>
     <w:multiLevelType w:val="multilevel"/>
     <w:tmpl w:val="ED1495B0"/>
@@ -16756,7 +17749,7 @@
       </w:rPr>
     </w:lvl>
   </w:abstractNum>
-  <w:abstractNum w:abstractNumId="120" w15:restartNumberingAfterBreak="0">
+  <w:abstractNum w:abstractNumId="122" w15:restartNumberingAfterBreak="0">
     <w:nsid w:val="67016F03"/>
     <w:multiLevelType w:val="hybridMultilevel"/>
     <w:tmpl w:val="06320602"/>
@@ -16869,7 +17862,7 @@
       </w:rPr>
     </w:lvl>
   </w:abstractNum>
-  <w:abstractNum w:abstractNumId="121" w15:restartNumberingAfterBreak="0">
+  <w:abstractNum w:abstractNumId="123" w15:restartNumberingAfterBreak="0">
     <w:nsid w:val="67031B0D"/>
     <w:multiLevelType w:val="hybridMultilevel"/>
     <w:tmpl w:val="ED8CB966"/>
@@ -16982,7 +17975,120 @@
       </w:rPr>
     </w:lvl>
   </w:abstractNum>
-  <w:abstractNum w:abstractNumId="122" w15:restartNumberingAfterBreak="0">
+  <w:abstractNum w:abstractNumId="124" w15:restartNumberingAfterBreak="0">
+    <w:nsid w:val="688D2503"/>
+    <w:multiLevelType w:val="hybridMultilevel"/>
+    <w:tmpl w:val="2B76C95E"/>
+    <w:lvl w:ilvl="0" w:tplc="04130001">
+      <w:start w:val="1"/>
+      <w:numFmt w:val="bullet"/>
+      <w:lvlText w:val=""/>
+      <w:lvlJc w:val="left"/>
+      <w:pPr>
+        <w:ind w:left="720" w:hanging="360"/>
+      </w:pPr>
+      <w:rPr>
+        <w:rFonts w:ascii="Symbol" w:hAnsi="Symbol" w:hint="default"/>
+      </w:rPr>
+    </w:lvl>
+    <w:lvl w:ilvl="1" w:tplc="04130003" w:tentative="1">
+      <w:start w:val="1"/>
+      <w:numFmt w:val="bullet"/>
+      <w:lvlText w:val="o"/>
+      <w:lvlJc w:val="left"/>
+      <w:pPr>
+        <w:ind w:left="1440" w:hanging="360"/>
+      </w:pPr>
+      <w:rPr>
+        <w:rFonts w:ascii="Courier New" w:hAnsi="Courier New" w:cs="Courier New" w:hint="default"/>
+      </w:rPr>
+    </w:lvl>
+    <w:lvl w:ilvl="2" w:tplc="04130005" w:tentative="1">
+      <w:start w:val="1"/>
+      <w:numFmt w:val="bullet"/>
+      <w:lvlText w:val=""/>
+      <w:lvlJc w:val="left"/>
+      <w:pPr>
+        <w:ind w:left="2160" w:hanging="360"/>
+      </w:pPr>
+      <w:rPr>
+        <w:rFonts w:ascii="Wingdings" w:hAnsi="Wingdings" w:hint="default"/>
+      </w:rPr>
+    </w:lvl>
+    <w:lvl w:ilvl="3" w:tplc="04130001" w:tentative="1">
+      <w:start w:val="1"/>
+      <w:numFmt w:val="bullet"/>
+      <w:lvlText w:val=""/>
+      <w:lvlJc w:val="left"/>
+      <w:pPr>
+        <w:ind w:left="2880" w:hanging="360"/>
+      </w:pPr>
+      <w:rPr>
+        <w:rFonts w:ascii="Symbol" w:hAnsi="Symbol" w:hint="default"/>
+      </w:rPr>
+    </w:lvl>
+    <w:lvl w:ilvl="4" w:tplc="04130003" w:tentative="1">
+      <w:start w:val="1"/>
+      <w:numFmt w:val="bullet"/>
+      <w:lvlText w:val="o"/>
+      <w:lvlJc w:val="left"/>
+      <w:pPr>
+        <w:ind w:left="3600" w:hanging="360"/>
+      </w:pPr>
+      <w:rPr>
+        <w:rFonts w:ascii="Courier New" w:hAnsi="Courier New" w:cs="Courier New" w:hint="default"/>
+      </w:rPr>
+    </w:lvl>
+    <w:lvl w:ilvl="5" w:tplc="04130005" w:tentative="1">
+      <w:start w:val="1"/>
+      <w:numFmt w:val="bullet"/>
+      <w:lvlText w:val=""/>
+      <w:lvlJc w:val="left"/>
+      <w:pPr>
+        <w:ind w:left="4320" w:hanging="360"/>
+      </w:pPr>
+      <w:rPr>
+        <w:rFonts w:ascii="Wingdings" w:hAnsi="Wingdings" w:hint="default"/>
+      </w:rPr>
+    </w:lvl>
+    <w:lvl w:ilvl="6" w:tplc="04130001" w:tentative="1">
+      <w:start w:val="1"/>
+      <w:numFmt w:val="bullet"/>
+      <w:lvlText w:val=""/>
+      <w:lvlJc w:val="left"/>
+      <w:pPr>
+        <w:ind w:left="5040" w:hanging="360"/>
+      </w:pPr>
+      <w:rPr>
+        <w:rFonts w:ascii="Symbol" w:hAnsi="Symbol" w:hint="default"/>
+      </w:rPr>
+    </w:lvl>
+    <w:lvl w:ilvl="7" w:tplc="04130003" w:tentative="1">
+      <w:start w:val="1"/>
+      <w:numFmt w:val="bullet"/>
+      <w:lvlText w:val="o"/>
+      <w:lvlJc w:val="left"/>
+      <w:pPr>
+        <w:ind w:left="5760" w:hanging="360"/>
+      </w:pPr>
+      <w:rPr>
+        <w:rFonts w:ascii="Courier New" w:hAnsi="Courier New" w:cs="Courier New" w:hint="default"/>
+      </w:rPr>
+    </w:lvl>
+    <w:lvl w:ilvl="8" w:tplc="04130005" w:tentative="1">
+      <w:start w:val="1"/>
+      <w:numFmt w:val="bullet"/>
+      <w:lvlText w:val=""/>
+      <w:lvlJc w:val="left"/>
+      <w:pPr>
+        <w:ind w:left="6480" w:hanging="360"/>
+      </w:pPr>
+      <w:rPr>
+        <w:rFonts w:ascii="Wingdings" w:hAnsi="Wingdings" w:hint="default"/>
+      </w:rPr>
+    </w:lvl>
+  </w:abstractNum>
+  <w:abstractNum w:abstractNumId="125" w15:restartNumberingAfterBreak="0">
     <w:nsid w:val="68CE00B0"/>
     <w:multiLevelType w:val="multilevel"/>
     <w:tmpl w:val="27543510"/>
@@ -17095,7 +18201,7 @@
       </w:pPr>
     </w:lvl>
   </w:abstractNum>
-  <w:abstractNum w:abstractNumId="123" w15:restartNumberingAfterBreak="0">
+  <w:abstractNum w:abstractNumId="126" w15:restartNumberingAfterBreak="0">
     <w:nsid w:val="68E8538C"/>
     <w:multiLevelType w:val="hybridMultilevel"/>
     <w:tmpl w:val="ECF4F46A"/>
@@ -17208,7 +18314,7 @@
       </w:rPr>
     </w:lvl>
   </w:abstractNum>
-  <w:abstractNum w:abstractNumId="124" w15:restartNumberingAfterBreak="0">
+  <w:abstractNum w:abstractNumId="127" w15:restartNumberingAfterBreak="0">
     <w:nsid w:val="6A064512"/>
     <w:multiLevelType w:val="multilevel"/>
     <w:tmpl w:val="C3BE07D2"/>
@@ -17324,7 +18430,7 @@
       </w:pPr>
     </w:lvl>
   </w:abstractNum>
-  <w:abstractNum w:abstractNumId="125" w15:restartNumberingAfterBreak="0">
+  <w:abstractNum w:abstractNumId="128" w15:restartNumberingAfterBreak="0">
     <w:nsid w:val="6A6A299E"/>
     <w:multiLevelType w:val="hybridMultilevel"/>
     <w:tmpl w:val="9552D15E"/>
@@ -17437,7 +18543,7 @@
       </w:rPr>
     </w:lvl>
   </w:abstractNum>
-  <w:abstractNum w:abstractNumId="126" w15:restartNumberingAfterBreak="0">
+  <w:abstractNum w:abstractNumId="129" w15:restartNumberingAfterBreak="0">
     <w:nsid w:val="6BC81A32"/>
     <w:multiLevelType w:val="multilevel"/>
     <w:tmpl w:val="3F504E52"/>
@@ -17550,7 +18656,7 @@
       </w:pPr>
     </w:lvl>
   </w:abstractNum>
-  <w:abstractNum w:abstractNumId="127" w15:restartNumberingAfterBreak="0">
+  <w:abstractNum w:abstractNumId="130" w15:restartNumberingAfterBreak="0">
     <w:nsid w:val="6C38000F"/>
     <w:multiLevelType w:val="multilevel"/>
     <w:tmpl w:val="E10058F2"/>
@@ -17699,7 +18805,7 @@
       </w:rPr>
     </w:lvl>
   </w:abstractNum>
-  <w:abstractNum w:abstractNumId="128" w15:restartNumberingAfterBreak="0">
+  <w:abstractNum w:abstractNumId="131" w15:restartNumberingAfterBreak="0">
     <w:nsid w:val="6D0112CD"/>
     <w:multiLevelType w:val="multilevel"/>
     <w:tmpl w:val="FDC6175C"/>
@@ -17848,7 +18954,7 @@
       </w:rPr>
     </w:lvl>
   </w:abstractNum>
-  <w:abstractNum w:abstractNumId="129" w15:restartNumberingAfterBreak="0">
+  <w:abstractNum w:abstractNumId="132" w15:restartNumberingAfterBreak="0">
     <w:nsid w:val="6D371494"/>
     <w:multiLevelType w:val="multilevel"/>
     <w:tmpl w:val="5FFCE284"/>
@@ -17961,7 +19067,7 @@
       </w:pPr>
     </w:lvl>
   </w:abstractNum>
-  <w:abstractNum w:abstractNumId="130" w15:restartNumberingAfterBreak="0">
+  <w:abstractNum w:abstractNumId="133" w15:restartNumberingAfterBreak="0">
     <w:nsid w:val="6E8D7834"/>
     <w:multiLevelType w:val="hybridMultilevel"/>
     <w:tmpl w:val="4BAC64A4"/>
@@ -18050,7 +19156,7 @@
       </w:pPr>
     </w:lvl>
   </w:abstractNum>
-  <w:abstractNum w:abstractNumId="131" w15:restartNumberingAfterBreak="0">
+  <w:abstractNum w:abstractNumId="134" w15:restartNumberingAfterBreak="0">
     <w:nsid w:val="6FCF2B91"/>
     <w:multiLevelType w:val="hybridMultilevel"/>
     <w:tmpl w:val="F7169806"/>
@@ -18163,7 +19269,7 @@
       </w:rPr>
     </w:lvl>
   </w:abstractNum>
-  <w:abstractNum w:abstractNumId="132" w15:restartNumberingAfterBreak="0">
+  <w:abstractNum w:abstractNumId="135" w15:restartNumberingAfterBreak="0">
     <w:nsid w:val="70D31428"/>
     <w:multiLevelType w:val="multilevel"/>
     <w:tmpl w:val="C8004DE4"/>
@@ -18312,7 +19418,7 @@
       </w:rPr>
     </w:lvl>
   </w:abstractNum>
-  <w:abstractNum w:abstractNumId="133" w15:restartNumberingAfterBreak="0">
+  <w:abstractNum w:abstractNumId="136" w15:restartNumberingAfterBreak="0">
     <w:nsid w:val="71F76E28"/>
     <w:multiLevelType w:val="hybridMultilevel"/>
     <w:tmpl w:val="9ED027E6"/>
@@ -18425,7 +19531,7 @@
       </w:rPr>
     </w:lvl>
   </w:abstractNum>
-  <w:abstractNum w:abstractNumId="134" w15:restartNumberingAfterBreak="0">
+  <w:abstractNum w:abstractNumId="137" w15:restartNumberingAfterBreak="0">
     <w:nsid w:val="723B072D"/>
     <w:multiLevelType w:val="multilevel"/>
     <w:tmpl w:val="F55A1A14"/>
@@ -18574,7 +19680,7 @@
       </w:rPr>
     </w:lvl>
   </w:abstractNum>
-  <w:abstractNum w:abstractNumId="135" w15:restartNumberingAfterBreak="0">
+  <w:abstractNum w:abstractNumId="138" w15:restartNumberingAfterBreak="0">
     <w:nsid w:val="72CA7ABA"/>
     <w:multiLevelType w:val="hybridMultilevel"/>
     <w:tmpl w:val="FE4C6E60"/>
@@ -18687,7 +19793,7 @@
       </w:rPr>
     </w:lvl>
   </w:abstractNum>
-  <w:abstractNum w:abstractNumId="136" w15:restartNumberingAfterBreak="0">
+  <w:abstractNum w:abstractNumId="139" w15:restartNumberingAfterBreak="0">
     <w:nsid w:val="7316539E"/>
     <w:multiLevelType w:val="hybridMultilevel"/>
     <w:tmpl w:val="5CDA8B16"/>
@@ -18800,7 +19906,7 @@
       </w:rPr>
     </w:lvl>
   </w:abstractNum>
-  <w:abstractNum w:abstractNumId="137" w15:restartNumberingAfterBreak="0">
+  <w:abstractNum w:abstractNumId="140" w15:restartNumberingAfterBreak="0">
     <w:nsid w:val="73624044"/>
     <w:multiLevelType w:val="hybridMultilevel"/>
     <w:tmpl w:val="70223D28"/>
@@ -18913,7 +20019,7 @@
       </w:rPr>
     </w:lvl>
   </w:abstractNum>
-  <w:abstractNum w:abstractNumId="138" w15:restartNumberingAfterBreak="0">
+  <w:abstractNum w:abstractNumId="141" w15:restartNumberingAfterBreak="0">
     <w:nsid w:val="749C5384"/>
     <w:multiLevelType w:val="multilevel"/>
     <w:tmpl w:val="835CC756"/>
@@ -19026,7 +20132,7 @@
       </w:pPr>
     </w:lvl>
   </w:abstractNum>
-  <w:abstractNum w:abstractNumId="139" w15:restartNumberingAfterBreak="0">
+  <w:abstractNum w:abstractNumId="142" w15:restartNumberingAfterBreak="0">
     <w:nsid w:val="751F72D4"/>
     <w:multiLevelType w:val="hybridMultilevel"/>
     <w:tmpl w:val="E41C86D8"/>
@@ -19139,7 +20245,7 @@
       </w:rPr>
     </w:lvl>
   </w:abstractNum>
-  <w:abstractNum w:abstractNumId="140" w15:restartNumberingAfterBreak="0">
+  <w:abstractNum w:abstractNumId="143" w15:restartNumberingAfterBreak="0">
     <w:nsid w:val="755F1117"/>
     <w:multiLevelType w:val="multilevel"/>
     <w:tmpl w:val="C46AA838"/>
@@ -19252,7 +20358,7 @@
       </w:pPr>
     </w:lvl>
   </w:abstractNum>
-  <w:abstractNum w:abstractNumId="141" w15:restartNumberingAfterBreak="0">
+  <w:abstractNum w:abstractNumId="144" w15:restartNumberingAfterBreak="0">
     <w:nsid w:val="76642A22"/>
     <w:multiLevelType w:val="hybridMultilevel"/>
     <w:tmpl w:val="48C2AE86"/>
@@ -19365,7 +20471,7 @@
       </w:rPr>
     </w:lvl>
   </w:abstractNum>
-  <w:abstractNum w:abstractNumId="142" w15:restartNumberingAfterBreak="0">
+  <w:abstractNum w:abstractNumId="145" w15:restartNumberingAfterBreak="0">
     <w:nsid w:val="766B34F8"/>
     <w:multiLevelType w:val="hybridMultilevel"/>
     <w:tmpl w:val="BE5428FE"/>
@@ -19478,7 +20584,7 @@
       </w:rPr>
     </w:lvl>
   </w:abstractNum>
-  <w:abstractNum w:abstractNumId="143" w15:restartNumberingAfterBreak="0">
+  <w:abstractNum w:abstractNumId="146" w15:restartNumberingAfterBreak="0">
     <w:nsid w:val="769865EA"/>
     <w:multiLevelType w:val="hybridMultilevel"/>
     <w:tmpl w:val="31EC9A76"/>
@@ -19591,7 +20697,7 @@
       </w:rPr>
     </w:lvl>
   </w:abstractNum>
-  <w:abstractNum w:abstractNumId="144" w15:restartNumberingAfterBreak="0">
+  <w:abstractNum w:abstractNumId="147" w15:restartNumberingAfterBreak="0">
     <w:nsid w:val="78D01882"/>
     <w:multiLevelType w:val="hybridMultilevel"/>
     <w:tmpl w:val="D298C77E"/>
@@ -19704,7 +20810,7 @@
       </w:rPr>
     </w:lvl>
   </w:abstractNum>
-  <w:abstractNum w:abstractNumId="145" w15:restartNumberingAfterBreak="0">
+  <w:abstractNum w:abstractNumId="148" w15:restartNumberingAfterBreak="0">
     <w:nsid w:val="78F05C76"/>
     <w:multiLevelType w:val="multilevel"/>
     <w:tmpl w:val="ABFC85CE"/>
@@ -19853,7 +20959,7 @@
       </w:rPr>
     </w:lvl>
   </w:abstractNum>
-  <w:abstractNum w:abstractNumId="146" w15:restartNumberingAfterBreak="0">
+  <w:abstractNum w:abstractNumId="149" w15:restartNumberingAfterBreak="0">
     <w:nsid w:val="79A62E93"/>
     <w:multiLevelType w:val="hybridMultilevel"/>
     <w:tmpl w:val="0958E252"/>
@@ -19967,43 +21073,43 @@
     </w:lvl>
   </w:abstractNum>
   <w:num w:numId="1" w16cid:durableId="591471716">
-    <w:abstractNumId w:val="49"/>
+    <w:abstractNumId w:val="50"/>
   </w:num>
   <w:num w:numId="2" w16cid:durableId="1229806096">
-    <w:abstractNumId w:val="112"/>
+    <w:abstractNumId w:val="114"/>
   </w:num>
   <w:num w:numId="3" w16cid:durableId="1485390088">
     <w:abstractNumId w:val="13"/>
   </w:num>
   <w:num w:numId="4" w16cid:durableId="248197328">
-    <w:abstractNumId w:val="109"/>
+    <w:abstractNumId w:val="111"/>
   </w:num>
   <w:num w:numId="5" w16cid:durableId="297807818">
-    <w:abstractNumId w:val="43"/>
+    <w:abstractNumId w:val="44"/>
   </w:num>
   <w:num w:numId="6" w16cid:durableId="1247418585">
     <w:abstractNumId w:val="2"/>
   </w:num>
   <w:num w:numId="7" w16cid:durableId="411589848">
-    <w:abstractNumId w:val="29"/>
+    <w:abstractNumId w:val="30"/>
   </w:num>
   <w:num w:numId="8" w16cid:durableId="1222710899">
-    <w:abstractNumId w:val="137"/>
+    <w:abstractNumId w:val="140"/>
   </w:num>
   <w:num w:numId="9" w16cid:durableId="225073524">
     <w:abstractNumId w:val="1"/>
   </w:num>
   <w:num w:numId="10" w16cid:durableId="328796489">
-    <w:abstractNumId w:val="101"/>
+    <w:abstractNumId w:val="103"/>
   </w:num>
   <w:num w:numId="11" w16cid:durableId="403795097">
-    <w:abstractNumId w:val="131"/>
+    <w:abstractNumId w:val="134"/>
   </w:num>
   <w:num w:numId="12" w16cid:durableId="655037828">
-    <w:abstractNumId w:val="100"/>
+    <w:abstractNumId w:val="102"/>
   </w:num>
   <w:num w:numId="13" w16cid:durableId="360789764">
-    <w:abstractNumId w:val="99"/>
+    <w:abstractNumId w:val="101"/>
   </w:num>
   <w:num w:numId="14" w16cid:durableId="444882817">
     <w:abstractNumId w:val="6"/>
@@ -20012,37 +21118,37 @@
     <w:abstractNumId w:val="24"/>
   </w:num>
   <w:num w:numId="16" w16cid:durableId="356783716">
-    <w:abstractNumId w:val="55"/>
+    <w:abstractNumId w:val="56"/>
   </w:num>
   <w:num w:numId="17" w16cid:durableId="430585440">
-    <w:abstractNumId w:val="83"/>
+    <w:abstractNumId w:val="85"/>
   </w:num>
   <w:num w:numId="18" w16cid:durableId="817452946">
-    <w:abstractNumId w:val="52"/>
+    <w:abstractNumId w:val="53"/>
   </w:num>
   <w:num w:numId="19" w16cid:durableId="1315452924">
-    <w:abstractNumId w:val="144"/>
+    <w:abstractNumId w:val="147"/>
   </w:num>
   <w:num w:numId="20" w16cid:durableId="690883037">
+    <w:abstractNumId w:val="38"/>
+  </w:num>
+  <w:num w:numId="21" w16cid:durableId="41223146">
+    <w:abstractNumId w:val="121"/>
+  </w:num>
+  <w:num w:numId="22" w16cid:durableId="1742675538">
+    <w:abstractNumId w:val="63"/>
+  </w:num>
+  <w:num w:numId="23" w16cid:durableId="704331105">
+    <w:abstractNumId w:val="77"/>
+  </w:num>
+  <w:num w:numId="24" w16cid:durableId="450977781">
     <w:abstractNumId w:val="37"/>
   </w:num>
-  <w:num w:numId="21" w16cid:durableId="41223146">
-    <w:abstractNumId w:val="119"/>
-  </w:num>
-  <w:num w:numId="22" w16cid:durableId="1742675538">
-    <w:abstractNumId w:val="61"/>
-  </w:num>
-  <w:num w:numId="23" w16cid:durableId="704331105">
-    <w:abstractNumId w:val="75"/>
-  </w:num>
-  <w:num w:numId="24" w16cid:durableId="450977781">
-    <w:abstractNumId w:val="36"/>
-  </w:num>
   <w:num w:numId="25" w16cid:durableId="1152528731">
-    <w:abstractNumId w:val="58"/>
+    <w:abstractNumId w:val="60"/>
   </w:num>
   <w:num w:numId="26" w16cid:durableId="506404774">
-    <w:abstractNumId w:val="121"/>
+    <w:abstractNumId w:val="123"/>
   </w:num>
   <w:num w:numId="27" w16cid:durableId="383414225">
     <w:abstractNumId w:val="5"/>
@@ -20051,361 +21157,370 @@
     <w:abstractNumId w:val="16"/>
   </w:num>
   <w:num w:numId="29" w16cid:durableId="800997860">
-    <w:abstractNumId w:val="26"/>
+    <w:abstractNumId w:val="27"/>
   </w:num>
   <w:num w:numId="30" w16cid:durableId="1292174479">
     <w:abstractNumId w:val="20"/>
   </w:num>
   <w:num w:numId="31" w16cid:durableId="850292924">
-    <w:abstractNumId w:val="56"/>
+    <w:abstractNumId w:val="57"/>
   </w:num>
   <w:num w:numId="32" w16cid:durableId="177961826">
-    <w:abstractNumId w:val="45"/>
+    <w:abstractNumId w:val="46"/>
   </w:num>
   <w:num w:numId="33" w16cid:durableId="1411198880">
-    <w:abstractNumId w:val="72"/>
+    <w:abstractNumId w:val="74"/>
   </w:num>
   <w:num w:numId="34" w16cid:durableId="543492258">
-    <w:abstractNumId w:val="125"/>
+    <w:abstractNumId w:val="128"/>
   </w:num>
   <w:num w:numId="35" w16cid:durableId="833957717">
     <w:abstractNumId w:val="15"/>
   </w:num>
   <w:num w:numId="36" w16cid:durableId="549146728">
-    <w:abstractNumId w:val="105"/>
+    <w:abstractNumId w:val="107"/>
   </w:num>
   <w:num w:numId="37" w16cid:durableId="1228373509">
-    <w:abstractNumId w:val="104"/>
+    <w:abstractNumId w:val="106"/>
   </w:num>
   <w:num w:numId="38" w16cid:durableId="1055663741">
-    <w:abstractNumId w:val="73"/>
+    <w:abstractNumId w:val="75"/>
   </w:num>
   <w:num w:numId="39" w16cid:durableId="1181433029">
     <w:abstractNumId w:val="18"/>
   </w:num>
   <w:num w:numId="40" w16cid:durableId="318533804">
-    <w:abstractNumId w:val="59"/>
+    <w:abstractNumId w:val="61"/>
   </w:num>
   <w:num w:numId="41" w16cid:durableId="889851619">
-    <w:abstractNumId w:val="89"/>
+    <w:abstractNumId w:val="91"/>
   </w:num>
   <w:num w:numId="42" w16cid:durableId="360204974">
-    <w:abstractNumId w:val="70"/>
+    <w:abstractNumId w:val="72"/>
   </w:num>
   <w:num w:numId="43" w16cid:durableId="850069339">
-    <w:abstractNumId w:val="116"/>
+    <w:abstractNumId w:val="118"/>
   </w:num>
   <w:num w:numId="44" w16cid:durableId="727848139">
-    <w:abstractNumId w:val="107"/>
+    <w:abstractNumId w:val="109"/>
   </w:num>
   <w:num w:numId="45" w16cid:durableId="1059018201">
-    <w:abstractNumId w:val="27"/>
+    <w:abstractNumId w:val="28"/>
   </w:num>
   <w:num w:numId="46" w16cid:durableId="1142307782">
-    <w:abstractNumId w:val="78"/>
+    <w:abstractNumId w:val="80"/>
   </w:num>
   <w:num w:numId="47" w16cid:durableId="639193733">
     <w:abstractNumId w:val="17"/>
   </w:num>
   <w:num w:numId="48" w16cid:durableId="855189474">
-    <w:abstractNumId w:val="53"/>
+    <w:abstractNumId w:val="54"/>
   </w:num>
   <w:num w:numId="49" w16cid:durableId="755902304">
-    <w:abstractNumId w:val="77"/>
+    <w:abstractNumId w:val="79"/>
   </w:num>
   <w:num w:numId="50" w16cid:durableId="128208264">
     <w:abstractNumId w:val="22"/>
   </w:num>
   <w:num w:numId="51" w16cid:durableId="1718967951">
-    <w:abstractNumId w:val="97"/>
+    <w:abstractNumId w:val="99"/>
   </w:num>
   <w:num w:numId="52" w16cid:durableId="96339671">
-    <w:abstractNumId w:val="28"/>
+    <w:abstractNumId w:val="29"/>
   </w:num>
   <w:num w:numId="53" w16cid:durableId="1808664498">
-    <w:abstractNumId w:val="133"/>
+    <w:abstractNumId w:val="136"/>
   </w:num>
   <w:num w:numId="54" w16cid:durableId="1101532550">
-    <w:abstractNumId w:val="146"/>
+    <w:abstractNumId w:val="149"/>
   </w:num>
   <w:num w:numId="55" w16cid:durableId="735126541">
-    <w:abstractNumId w:val="62"/>
+    <w:abstractNumId w:val="64"/>
   </w:num>
   <w:num w:numId="56" w16cid:durableId="2110929615">
-    <w:abstractNumId w:val="79"/>
+    <w:abstractNumId w:val="81"/>
   </w:num>
   <w:num w:numId="57" w16cid:durableId="1672826851">
-    <w:abstractNumId w:val="139"/>
+    <w:abstractNumId w:val="142"/>
   </w:num>
   <w:num w:numId="58" w16cid:durableId="1197810663">
     <w:abstractNumId w:val="0"/>
   </w:num>
   <w:num w:numId="59" w16cid:durableId="1325549743">
-    <w:abstractNumId w:val="31"/>
+    <w:abstractNumId w:val="32"/>
   </w:num>
   <w:num w:numId="60" w16cid:durableId="1872451785">
-    <w:abstractNumId w:val="115"/>
+    <w:abstractNumId w:val="117"/>
   </w:num>
   <w:num w:numId="61" w16cid:durableId="290670216">
-    <w:abstractNumId w:val="130"/>
+    <w:abstractNumId w:val="133"/>
   </w:num>
   <w:num w:numId="62" w16cid:durableId="1191184418">
-    <w:abstractNumId w:val="34"/>
+    <w:abstractNumId w:val="35"/>
   </w:num>
   <w:num w:numId="63" w16cid:durableId="1468476046">
-    <w:abstractNumId w:val="102"/>
+    <w:abstractNumId w:val="104"/>
   </w:num>
   <w:num w:numId="64" w16cid:durableId="494108652">
-    <w:abstractNumId w:val="118"/>
+    <w:abstractNumId w:val="120"/>
   </w:num>
   <w:num w:numId="65" w16cid:durableId="684481424">
-    <w:abstractNumId w:val="142"/>
+    <w:abstractNumId w:val="145"/>
   </w:num>
   <w:num w:numId="66" w16cid:durableId="1174417659">
-    <w:abstractNumId w:val="95"/>
+    <w:abstractNumId w:val="97"/>
   </w:num>
   <w:num w:numId="67" w16cid:durableId="1423146336">
-    <w:abstractNumId w:val="138"/>
+    <w:abstractNumId w:val="141"/>
   </w:num>
   <w:num w:numId="68" w16cid:durableId="778571802">
-    <w:abstractNumId w:val="76"/>
+    <w:abstractNumId w:val="78"/>
   </w:num>
   <w:num w:numId="69" w16cid:durableId="116485366">
-    <w:abstractNumId w:val="87"/>
+    <w:abstractNumId w:val="89"/>
   </w:num>
   <w:num w:numId="70" w16cid:durableId="854928962">
-    <w:abstractNumId w:val="86"/>
+    <w:abstractNumId w:val="88"/>
   </w:num>
   <w:num w:numId="71" w16cid:durableId="752630203">
-    <w:abstractNumId w:val="124"/>
+    <w:abstractNumId w:val="127"/>
   </w:num>
   <w:num w:numId="72" w16cid:durableId="1196698600">
     <w:abstractNumId w:val="14"/>
   </w:num>
   <w:num w:numId="73" w16cid:durableId="919563883">
-    <w:abstractNumId w:val="106"/>
+    <w:abstractNumId w:val="108"/>
   </w:num>
   <w:num w:numId="74" w16cid:durableId="1190408454">
-    <w:abstractNumId w:val="128"/>
+    <w:abstractNumId w:val="131"/>
   </w:num>
   <w:num w:numId="75" w16cid:durableId="1675499397">
     <w:abstractNumId w:val="4"/>
   </w:num>
   <w:num w:numId="76" w16cid:durableId="998994486">
-    <w:abstractNumId w:val="68"/>
+    <w:abstractNumId w:val="70"/>
   </w:num>
   <w:num w:numId="77" w16cid:durableId="836070444">
-    <w:abstractNumId w:val="33"/>
+    <w:abstractNumId w:val="34"/>
   </w:num>
   <w:num w:numId="78" w16cid:durableId="429353773">
+    <w:abstractNumId w:val="129"/>
+  </w:num>
+  <w:num w:numId="79" w16cid:durableId="544099402">
     <w:abstractNumId w:val="126"/>
   </w:num>
-  <w:num w:numId="79" w16cid:durableId="544099402">
-    <w:abstractNumId w:val="123"/>
-  </w:num>
   <w:num w:numId="80" w16cid:durableId="1742210400">
-    <w:abstractNumId w:val="143"/>
+    <w:abstractNumId w:val="146"/>
   </w:num>
   <w:num w:numId="81" w16cid:durableId="1763722220">
     <w:abstractNumId w:val="10"/>
   </w:num>
   <w:num w:numId="82" w16cid:durableId="1534876415">
-    <w:abstractNumId w:val="35"/>
+    <w:abstractNumId w:val="36"/>
   </w:num>
   <w:num w:numId="83" w16cid:durableId="742359">
     <w:abstractNumId w:val="25"/>
   </w:num>
   <w:num w:numId="84" w16cid:durableId="1282615057">
-    <w:abstractNumId w:val="141"/>
+    <w:abstractNumId w:val="144"/>
   </w:num>
   <w:num w:numId="85" w16cid:durableId="974720112">
-    <w:abstractNumId w:val="110"/>
+    <w:abstractNumId w:val="112"/>
   </w:num>
   <w:num w:numId="86" w16cid:durableId="915674824">
-    <w:abstractNumId w:val="50"/>
+    <w:abstractNumId w:val="51"/>
   </w:num>
   <w:num w:numId="87" w16cid:durableId="1016271509">
-    <w:abstractNumId w:val="91"/>
+    <w:abstractNumId w:val="93"/>
   </w:num>
   <w:num w:numId="88" w16cid:durableId="1257403724">
-    <w:abstractNumId w:val="41"/>
+    <w:abstractNumId w:val="42"/>
   </w:num>
   <w:num w:numId="89" w16cid:durableId="48234611">
-    <w:abstractNumId w:val="85"/>
+    <w:abstractNumId w:val="87"/>
   </w:num>
   <w:num w:numId="90" w16cid:durableId="1202476677">
-    <w:abstractNumId w:val="114"/>
+    <w:abstractNumId w:val="116"/>
   </w:num>
   <w:num w:numId="91" w16cid:durableId="1826628341">
-    <w:abstractNumId w:val="145"/>
+    <w:abstractNumId w:val="148"/>
   </w:num>
   <w:num w:numId="92" w16cid:durableId="199438956">
     <w:abstractNumId w:val="7"/>
   </w:num>
   <w:num w:numId="93" w16cid:durableId="1300568546">
-    <w:abstractNumId w:val="113"/>
+    <w:abstractNumId w:val="115"/>
   </w:num>
   <w:num w:numId="94" w16cid:durableId="1576161706">
-    <w:abstractNumId w:val="64"/>
+    <w:abstractNumId w:val="66"/>
   </w:num>
   <w:num w:numId="95" w16cid:durableId="132989763">
-    <w:abstractNumId w:val="42"/>
+    <w:abstractNumId w:val="43"/>
   </w:num>
   <w:num w:numId="96" w16cid:durableId="1052462517">
-    <w:abstractNumId w:val="117"/>
+    <w:abstractNumId w:val="119"/>
   </w:num>
   <w:num w:numId="97" w16cid:durableId="2090039560">
-    <w:abstractNumId w:val="122"/>
+    <w:abstractNumId w:val="125"/>
   </w:num>
   <w:num w:numId="98" w16cid:durableId="1860122427">
     <w:abstractNumId w:val="19"/>
   </w:num>
   <w:num w:numId="99" w16cid:durableId="620234013">
-    <w:abstractNumId w:val="111"/>
+    <w:abstractNumId w:val="113"/>
   </w:num>
   <w:num w:numId="100" w16cid:durableId="1422215242">
-    <w:abstractNumId w:val="132"/>
+    <w:abstractNumId w:val="135"/>
   </w:num>
   <w:num w:numId="101" w16cid:durableId="1065450225">
-    <w:abstractNumId w:val="84"/>
+    <w:abstractNumId w:val="86"/>
   </w:num>
   <w:num w:numId="102" w16cid:durableId="1953514777">
     <w:abstractNumId w:val="11"/>
   </w:num>
   <w:num w:numId="103" w16cid:durableId="1978561383">
-    <w:abstractNumId w:val="88"/>
+    <w:abstractNumId w:val="90"/>
   </w:num>
   <w:num w:numId="104" w16cid:durableId="1477799901">
-    <w:abstractNumId w:val="92"/>
+    <w:abstractNumId w:val="94"/>
   </w:num>
   <w:num w:numId="105" w16cid:durableId="241378896">
-    <w:abstractNumId w:val="136"/>
+    <w:abstractNumId w:val="139"/>
   </w:num>
   <w:num w:numId="106" w16cid:durableId="697043649">
-    <w:abstractNumId w:val="44"/>
+    <w:abstractNumId w:val="45"/>
   </w:num>
   <w:num w:numId="107" w16cid:durableId="1589003401">
     <w:abstractNumId w:val="9"/>
   </w:num>
   <w:num w:numId="108" w16cid:durableId="252780459">
-    <w:abstractNumId w:val="63"/>
+    <w:abstractNumId w:val="65"/>
   </w:num>
   <w:num w:numId="109" w16cid:durableId="791360032">
-    <w:abstractNumId w:val="65"/>
+    <w:abstractNumId w:val="67"/>
   </w:num>
   <w:num w:numId="110" w16cid:durableId="2093575344">
-    <w:abstractNumId w:val="140"/>
+    <w:abstractNumId w:val="143"/>
   </w:num>
   <w:num w:numId="111" w16cid:durableId="786584446">
-    <w:abstractNumId w:val="96"/>
+    <w:abstractNumId w:val="98"/>
   </w:num>
   <w:num w:numId="112" w16cid:durableId="2126002490">
-    <w:abstractNumId w:val="39"/>
+    <w:abstractNumId w:val="40"/>
   </w:num>
   <w:num w:numId="113" w16cid:durableId="490371555">
-    <w:abstractNumId w:val="74"/>
+    <w:abstractNumId w:val="76"/>
   </w:num>
   <w:num w:numId="114" w16cid:durableId="1746025033">
-    <w:abstractNumId w:val="60"/>
+    <w:abstractNumId w:val="62"/>
   </w:num>
   <w:num w:numId="115" w16cid:durableId="291329302">
-    <w:abstractNumId w:val="71"/>
+    <w:abstractNumId w:val="73"/>
   </w:num>
   <w:num w:numId="116" w16cid:durableId="1952974138">
-    <w:abstractNumId w:val="30"/>
+    <w:abstractNumId w:val="31"/>
   </w:num>
   <w:num w:numId="117" w16cid:durableId="1976443509">
     <w:abstractNumId w:val="12"/>
   </w:num>
   <w:num w:numId="118" w16cid:durableId="1035928287">
-    <w:abstractNumId w:val="81"/>
+    <w:abstractNumId w:val="83"/>
   </w:num>
   <w:num w:numId="119" w16cid:durableId="1400522723">
     <w:abstractNumId w:val="23"/>
   </w:num>
   <w:num w:numId="120" w16cid:durableId="855197765">
-    <w:abstractNumId w:val="54"/>
+    <w:abstractNumId w:val="55"/>
   </w:num>
   <w:num w:numId="121" w16cid:durableId="1965387445">
-    <w:abstractNumId w:val="98"/>
+    <w:abstractNumId w:val="100"/>
   </w:num>
   <w:num w:numId="122" w16cid:durableId="237399120">
     <w:abstractNumId w:val="21"/>
   </w:num>
   <w:num w:numId="123" w16cid:durableId="1855877355">
-    <w:abstractNumId w:val="108"/>
+    <w:abstractNumId w:val="110"/>
   </w:num>
   <w:num w:numId="124" w16cid:durableId="1748263515">
-    <w:abstractNumId w:val="93"/>
+    <w:abstractNumId w:val="95"/>
   </w:num>
   <w:num w:numId="125" w16cid:durableId="307516309">
-    <w:abstractNumId w:val="51"/>
+    <w:abstractNumId w:val="52"/>
   </w:num>
   <w:num w:numId="126" w16cid:durableId="736174539">
-    <w:abstractNumId w:val="40"/>
+    <w:abstractNumId w:val="41"/>
   </w:num>
   <w:num w:numId="127" w16cid:durableId="947585030">
-    <w:abstractNumId w:val="94"/>
+    <w:abstractNumId w:val="96"/>
   </w:num>
   <w:num w:numId="128" w16cid:durableId="182407282">
-    <w:abstractNumId w:val="135"/>
+    <w:abstractNumId w:val="138"/>
   </w:num>
   <w:num w:numId="129" w16cid:durableId="329606671">
-    <w:abstractNumId w:val="32"/>
+    <w:abstractNumId w:val="33"/>
   </w:num>
   <w:num w:numId="130" w16cid:durableId="1246181357">
-    <w:abstractNumId w:val="66"/>
+    <w:abstractNumId w:val="68"/>
   </w:num>
   <w:num w:numId="131" w16cid:durableId="1771201903">
-    <w:abstractNumId w:val="127"/>
+    <w:abstractNumId w:val="130"/>
   </w:num>
   <w:num w:numId="132" w16cid:durableId="842936484">
-    <w:abstractNumId w:val="67"/>
+    <w:abstractNumId w:val="69"/>
   </w:num>
   <w:num w:numId="133" w16cid:durableId="441153255">
-    <w:abstractNumId w:val="57"/>
+    <w:abstractNumId w:val="58"/>
   </w:num>
   <w:num w:numId="134" w16cid:durableId="2093238875">
-    <w:abstractNumId w:val="82"/>
+    <w:abstractNumId w:val="84"/>
   </w:num>
   <w:num w:numId="135" w16cid:durableId="533348742">
-    <w:abstractNumId w:val="90"/>
+    <w:abstractNumId w:val="92"/>
   </w:num>
   <w:num w:numId="136" w16cid:durableId="995500370">
-    <w:abstractNumId w:val="129"/>
+    <w:abstractNumId w:val="132"/>
   </w:num>
   <w:num w:numId="137" w16cid:durableId="2062748512">
     <w:abstractNumId w:val="8"/>
   </w:num>
   <w:num w:numId="138" w16cid:durableId="1922325559">
-    <w:abstractNumId w:val="120"/>
+    <w:abstractNumId w:val="122"/>
   </w:num>
   <w:num w:numId="139" w16cid:durableId="798307024">
     <w:abstractNumId w:val="3"/>
   </w:num>
   <w:num w:numId="140" w16cid:durableId="1611934016">
-    <w:abstractNumId w:val="69"/>
+    <w:abstractNumId w:val="71"/>
   </w:num>
   <w:num w:numId="141" w16cid:durableId="988560426">
-    <w:abstractNumId w:val="80"/>
+    <w:abstractNumId w:val="82"/>
   </w:num>
   <w:num w:numId="142" w16cid:durableId="2022126862">
-    <w:abstractNumId w:val="134"/>
+    <w:abstractNumId w:val="137"/>
   </w:num>
   <w:num w:numId="143" w16cid:durableId="1644769614">
-    <w:abstractNumId w:val="38"/>
+    <w:abstractNumId w:val="39"/>
   </w:num>
   <w:num w:numId="144" w16cid:durableId="1584607112">
+    <w:abstractNumId w:val="48"/>
+  </w:num>
+  <w:num w:numId="145" w16cid:durableId="1210678766">
+    <w:abstractNumId w:val="105"/>
+  </w:num>
+  <w:num w:numId="146" w16cid:durableId="396562337">
+    <w:abstractNumId w:val="49"/>
+  </w:num>
+  <w:num w:numId="147" w16cid:durableId="1489243948">
     <w:abstractNumId w:val="47"/>
   </w:num>
-  <w:num w:numId="145" w16cid:durableId="1210678766">
-    <w:abstractNumId w:val="103"/>
+  <w:num w:numId="148" w16cid:durableId="985663430">
+    <w:abstractNumId w:val="124"/>
   </w:num>
-  <w:num w:numId="146" w16cid:durableId="396562337">
-    <w:abstractNumId w:val="48"/>
+  <w:num w:numId="149" w16cid:durableId="379593093">
+    <w:abstractNumId w:val="26"/>
   </w:num>
-  <w:num w:numId="147" w16cid:durableId="1489243948">
-    <w:abstractNumId w:val="46"/>
+  <w:num w:numId="150" w16cid:durableId="307829262">
+    <w:abstractNumId w:val="59"/>
   </w:num>
   <w:numIdMacAtCleanup w:val="47"/>
 </w:numbering>
@@ -21017,7 +22132,6 @@
   <w:style w:type="character" w:default="1" w:styleId="Standaardalinea-lettertype">
     <w:name w:val="Default Paragraph Font"/>
     <w:uiPriority w:val="1"/>
-    <w:semiHidden/>
     <w:unhideWhenUsed/>
   </w:style>
   <w:style w:type="table" w:default="1" w:styleId="Standaardtabel">

</xml_diff>